<commit_message>
Phase 1 terminée - Conception UI + Cahier des charges fonctionnel
</commit_message>
<xml_diff>
--- a/Le livrable personalisé.docx
+++ b/Le livrable personalisé.docx
@@ -1241,6 +1241,1606 @@
     </w:p>
     <w:p>
       <w:pPr>
+        <w:pStyle w:val="BodyText"/>
+        <w:tabs>
+          <w:tab w:val="left" w:pos="709" w:leader="none"/>
+        </w:tabs>
+        <w:bidi w:val="0"/>
+        <w:ind w:hanging="0" w:start="709"/>
+        <w:jc w:val="start"/>
+        <w:rPr/>
+      </w:pPr>
+      <w:r>
+        <w:rPr/>
+      </w:r>
+    </w:p>
+    <w:p>
+      <w:pPr>
+        <w:pStyle w:val="BodyText"/>
+        <w:tabs>
+          <w:tab w:val="left" w:pos="709" w:leader="none"/>
+        </w:tabs>
+        <w:bidi w:val="0"/>
+        <w:ind w:hanging="0" w:start="709"/>
+        <w:jc w:val="start"/>
+        <w:rPr/>
+      </w:pPr>
+      <w:r>
+        <w:rPr>
+          <w:rStyle w:val="Strong"/>
+        </w:rPr>
+        <w:t>3. Conception des Interfaces Utilisateur et Administrateur</w:t>
+      </w:r>
+    </w:p>
+    <w:p>
+      <w:pPr>
+        <w:pStyle w:val="BodyText"/>
+        <w:ind w:hanging="0" w:start="0" w:end="0"/>
+        <w:rPr/>
+      </w:pPr>
+      <w:r>
+        <w:rPr>
+          <w:rStyle w:val="Strong"/>
+        </w:rPr>
+        <w:t>3.1 Interface Utilisateur (Portail Captif)</w:t>
+      </w:r>
+    </w:p>
+    <w:p>
+      <w:pPr>
+        <w:pStyle w:val="BodyText"/>
+        <w:numPr>
+          <w:ilvl w:val="0"/>
+          <w:numId w:val="14"/>
+        </w:numPr>
+        <w:tabs>
+          <w:tab w:val="clear" w:pos="709"/>
+          <w:tab w:val="left" w:pos="0" w:leader="none"/>
+        </w:tabs>
+        <w:spacing w:before="0" w:after="0"/>
+        <w:ind w:hanging="283" w:start="709"/>
+        <w:rPr/>
+      </w:pPr>
+      <w:r>
+        <w:rPr/>
+        <w:t xml:space="preserve">Page de Login </w:t>
+      </w:r>
+    </w:p>
+    <w:p>
+      <w:pPr>
+        <w:pStyle w:val="BodyText"/>
+        <w:numPr>
+          <w:ilvl w:val="0"/>
+          <w:numId w:val="0"/>
+        </w:numPr>
+        <w:spacing w:before="0" w:after="0"/>
+        <w:ind w:hanging="0" w:start="0"/>
+        <w:rPr/>
+      </w:pPr>
+      <w:r>
+        <w:rPr/>
+      </w:r>
+    </w:p>
+    <w:p>
+      <w:pPr>
+        <w:pStyle w:val="BodyText"/>
+        <w:spacing w:before="0" w:after="0"/>
+        <w:rPr/>
+      </w:pPr>
+      <w:r>
+        <w:rPr/>
+        <w:drawing>
+          <wp:anchor behindDoc="0" distT="0" distB="0" distL="0" distR="0" simplePos="0" locked="0" layoutInCell="0" allowOverlap="1" relativeHeight="2">
+            <wp:simplePos x="0" y="0"/>
+            <wp:positionH relativeFrom="column">
+              <wp:posOffset>545465</wp:posOffset>
+            </wp:positionH>
+            <wp:positionV relativeFrom="paragraph">
+              <wp:posOffset>-2540</wp:posOffset>
+            </wp:positionV>
+            <wp:extent cx="2676525" cy="2295525"/>
+            <wp:effectExtent l="0" t="0" r="0" b="0"/>
+            <wp:wrapSquare wrapText="largest"/>
+            <wp:docPr id="1" name="Image1" descr="" title=""/>
+            <wp:cNvGraphicFramePr>
+              <a:graphicFrameLocks xmlns:a="http://schemas.openxmlformats.org/drawingml/2006/main" noChangeAspect="1"/>
+            </wp:cNvGraphicFramePr>
+            <a:graphic xmlns:a="http://schemas.openxmlformats.org/drawingml/2006/main">
+              <a:graphicData uri="http://schemas.openxmlformats.org/drawingml/2006/picture">
+                <pic:pic xmlns:pic="http://schemas.openxmlformats.org/drawingml/2006/picture">
+                  <pic:nvPicPr>
+                    <pic:cNvPr id="1" name="Image1" descr="" title=""/>
+                    <pic:cNvPicPr>
+                      <a:picLocks noChangeAspect="1" noChangeArrowheads="1"/>
+                    </pic:cNvPicPr>
+                  </pic:nvPicPr>
+                  <pic:blipFill>
+                    <a:blip r:embed="rId2"/>
+                    <a:srcRect l="27192" t="5433" r="27050" b="31769"/>
+                    <a:stretch>
+                      <a:fillRect/>
+                    </a:stretch>
+                  </pic:blipFill>
+                  <pic:spPr bwMode="auto">
+                    <a:xfrm>
+                      <a:off x="0" y="0"/>
+                      <a:ext cx="2676525" cy="2295525"/>
+                    </a:xfrm>
+                    <a:prstGeom prst="rect">
+                      <a:avLst/>
+                    </a:prstGeom>
+                  </pic:spPr>
+                </pic:pic>
+              </a:graphicData>
+            </a:graphic>
+          </wp:anchor>
+        </w:drawing>
+      </w:r>
+    </w:p>
+    <w:p>
+      <w:pPr>
+        <w:pStyle w:val="BodyText"/>
+        <w:spacing w:before="0" w:after="0"/>
+        <w:rPr/>
+      </w:pPr>
+      <w:r>
+        <w:rPr/>
+      </w:r>
+    </w:p>
+    <w:p>
+      <w:pPr>
+        <w:pStyle w:val="BodyText"/>
+        <w:spacing w:before="0" w:after="0"/>
+        <w:rPr/>
+      </w:pPr>
+      <w:r>
+        <w:rPr/>
+      </w:r>
+    </w:p>
+    <w:p>
+      <w:pPr>
+        <w:pStyle w:val="BodyText"/>
+        <w:spacing w:before="0" w:after="0"/>
+        <w:rPr/>
+      </w:pPr>
+      <w:r>
+        <w:rPr/>
+      </w:r>
+    </w:p>
+    <w:p>
+      <w:pPr>
+        <w:pStyle w:val="BodyText"/>
+        <w:spacing w:before="0" w:after="0"/>
+        <w:rPr/>
+      </w:pPr>
+      <w:r>
+        <w:rPr/>
+      </w:r>
+    </w:p>
+    <w:p>
+      <w:pPr>
+        <w:pStyle w:val="BodyText"/>
+        <w:spacing w:before="0" w:after="0"/>
+        <w:rPr/>
+      </w:pPr>
+      <w:r>
+        <w:rPr/>
+      </w:r>
+    </w:p>
+    <w:p>
+      <w:pPr>
+        <w:pStyle w:val="BodyText"/>
+        <w:spacing w:before="0" w:after="0"/>
+        <w:rPr/>
+      </w:pPr>
+      <w:r>
+        <w:rPr/>
+      </w:r>
+    </w:p>
+    <w:p>
+      <w:pPr>
+        <w:pStyle w:val="BodyText"/>
+        <w:spacing w:before="0" w:after="0"/>
+        <w:rPr/>
+      </w:pPr>
+      <w:r>
+        <w:rPr/>
+      </w:r>
+    </w:p>
+    <w:p>
+      <w:pPr>
+        <w:pStyle w:val="BodyText"/>
+        <w:spacing w:before="0" w:after="0"/>
+        <w:rPr/>
+      </w:pPr>
+      <w:r>
+        <w:rPr/>
+      </w:r>
+    </w:p>
+    <w:p>
+      <w:pPr>
+        <w:pStyle w:val="BodyText"/>
+        <w:spacing w:before="0" w:after="0"/>
+        <w:rPr/>
+      </w:pPr>
+      <w:r>
+        <w:rPr/>
+      </w:r>
+    </w:p>
+    <w:p>
+      <w:pPr>
+        <w:pStyle w:val="BodyText"/>
+        <w:spacing w:before="0" w:after="0"/>
+        <w:rPr/>
+      </w:pPr>
+      <w:r>
+        <w:rPr/>
+      </w:r>
+    </w:p>
+    <w:p>
+      <w:pPr>
+        <w:pStyle w:val="BodyText"/>
+        <w:spacing w:before="0" w:after="0"/>
+        <w:rPr/>
+      </w:pPr>
+      <w:r>
+        <w:rPr/>
+      </w:r>
+    </w:p>
+    <w:p>
+      <w:pPr>
+        <w:pStyle w:val="BodyText"/>
+        <w:spacing w:before="0" w:after="0"/>
+        <w:rPr/>
+      </w:pPr>
+      <w:r>
+        <w:rPr/>
+      </w:r>
+    </w:p>
+    <w:p>
+      <w:pPr>
+        <w:pStyle w:val="BodyText"/>
+        <w:numPr>
+          <w:ilvl w:val="0"/>
+          <w:numId w:val="14"/>
+        </w:numPr>
+        <w:tabs>
+          <w:tab w:val="clear" w:pos="709"/>
+          <w:tab w:val="left" w:pos="0" w:leader="none"/>
+        </w:tabs>
+        <w:spacing w:before="0" w:after="0"/>
+        <w:ind w:hanging="283" w:start="709"/>
+        <w:rPr/>
+      </w:pPr>
+      <w:r>
+        <w:rPr/>
+        <w:t xml:space="preserve">Page de Statut de Connexion </w:t>
+      </w:r>
+    </w:p>
+    <w:p>
+      <w:pPr>
+        <w:pStyle w:val="BodyText"/>
+        <w:spacing w:before="0" w:after="0"/>
+        <w:rPr/>
+      </w:pPr>
+      <w:r>
+        <w:rPr/>
+      </w:r>
+    </w:p>
+    <w:p>
+      <w:pPr>
+        <w:pStyle w:val="BodyText"/>
+        <w:spacing w:before="0" w:after="0"/>
+        <w:rPr/>
+      </w:pPr>
+      <w:r>
+        <w:rPr/>
+        <w:drawing>
+          <wp:anchor behindDoc="0" distT="0" distB="0" distL="0" distR="0" simplePos="0" locked="0" layoutInCell="0" allowOverlap="1" relativeHeight="3">
+            <wp:simplePos x="0" y="0"/>
+            <wp:positionH relativeFrom="column">
+              <wp:posOffset>440690</wp:posOffset>
+            </wp:positionH>
+            <wp:positionV relativeFrom="paragraph">
+              <wp:posOffset>-2540</wp:posOffset>
+            </wp:positionV>
+            <wp:extent cx="4554220" cy="2466975"/>
+            <wp:effectExtent l="0" t="0" r="0" b="0"/>
+            <wp:wrapSquare wrapText="largest"/>
+            <wp:docPr id="2" name="Image2" descr="" title=""/>
+            <wp:cNvGraphicFramePr>
+              <a:graphicFrameLocks xmlns:a="http://schemas.openxmlformats.org/drawingml/2006/main" noChangeAspect="1"/>
+            </wp:cNvGraphicFramePr>
+            <a:graphic xmlns:a="http://schemas.openxmlformats.org/drawingml/2006/main">
+              <a:graphicData uri="http://schemas.openxmlformats.org/drawingml/2006/picture">
+                <pic:pic xmlns:pic="http://schemas.openxmlformats.org/drawingml/2006/picture">
+                  <pic:nvPicPr>
+                    <pic:cNvPr id="2" name="Image2" descr="" title=""/>
+                    <pic:cNvPicPr>
+                      <a:picLocks noChangeAspect="1" noChangeArrowheads="1"/>
+                    </pic:cNvPicPr>
+                  </pic:nvPicPr>
+                  <pic:blipFill>
+                    <a:blip r:embed="rId3"/>
+                    <a:srcRect l="5933" t="13484" r="19650" b="22014"/>
+                    <a:stretch>
+                      <a:fillRect/>
+                    </a:stretch>
+                  </pic:blipFill>
+                  <pic:spPr bwMode="auto">
+                    <a:xfrm>
+                      <a:off x="0" y="0"/>
+                      <a:ext cx="4554220" cy="2466975"/>
+                    </a:xfrm>
+                    <a:prstGeom prst="rect">
+                      <a:avLst/>
+                    </a:prstGeom>
+                  </pic:spPr>
+                </pic:pic>
+              </a:graphicData>
+            </a:graphic>
+          </wp:anchor>
+        </w:drawing>
+      </w:r>
+    </w:p>
+    <w:p>
+      <w:pPr>
+        <w:pStyle w:val="BodyText"/>
+        <w:spacing w:before="0" w:after="0"/>
+        <w:rPr/>
+      </w:pPr>
+      <w:r>
+        <w:rPr/>
+      </w:r>
+    </w:p>
+    <w:p>
+      <w:pPr>
+        <w:pStyle w:val="BodyText"/>
+        <w:spacing w:before="0" w:after="0"/>
+        <w:rPr/>
+      </w:pPr>
+      <w:r>
+        <w:rPr/>
+      </w:r>
+    </w:p>
+    <w:p>
+      <w:pPr>
+        <w:pStyle w:val="BodyText"/>
+        <w:spacing w:before="0" w:after="0"/>
+        <w:rPr/>
+      </w:pPr>
+      <w:r>
+        <w:rPr/>
+      </w:r>
+    </w:p>
+    <w:p>
+      <w:pPr>
+        <w:pStyle w:val="BodyText"/>
+        <w:spacing w:before="0" w:after="0"/>
+        <w:rPr/>
+      </w:pPr>
+      <w:r>
+        <w:rPr/>
+      </w:r>
+    </w:p>
+    <w:p>
+      <w:pPr>
+        <w:pStyle w:val="BodyText"/>
+        <w:spacing w:before="0" w:after="0"/>
+        <w:rPr/>
+      </w:pPr>
+      <w:r>
+        <w:rPr/>
+      </w:r>
+    </w:p>
+    <w:p>
+      <w:pPr>
+        <w:pStyle w:val="BodyText"/>
+        <w:spacing w:before="0" w:after="0"/>
+        <w:rPr/>
+      </w:pPr>
+      <w:r>
+        <w:rPr/>
+      </w:r>
+    </w:p>
+    <w:p>
+      <w:pPr>
+        <w:pStyle w:val="BodyText"/>
+        <w:spacing w:before="0" w:after="0"/>
+        <w:rPr/>
+      </w:pPr>
+      <w:r>
+        <w:rPr/>
+      </w:r>
+    </w:p>
+    <w:p>
+      <w:pPr>
+        <w:pStyle w:val="BodyText"/>
+        <w:spacing w:before="0" w:after="0"/>
+        <w:rPr/>
+      </w:pPr>
+      <w:r>
+        <w:rPr/>
+      </w:r>
+    </w:p>
+    <w:p>
+      <w:pPr>
+        <w:pStyle w:val="BodyText"/>
+        <w:spacing w:before="0" w:after="0"/>
+        <w:rPr/>
+      </w:pPr>
+      <w:r>
+        <w:rPr/>
+      </w:r>
+    </w:p>
+    <w:p>
+      <w:pPr>
+        <w:pStyle w:val="BodyText"/>
+        <w:spacing w:before="0" w:after="0"/>
+        <w:rPr/>
+      </w:pPr>
+      <w:r>
+        <w:rPr/>
+      </w:r>
+    </w:p>
+    <w:p>
+      <w:pPr>
+        <w:pStyle w:val="BodyText"/>
+        <w:spacing w:before="0" w:after="0"/>
+        <w:rPr/>
+      </w:pPr>
+      <w:r>
+        <w:rPr/>
+      </w:r>
+    </w:p>
+    <w:p>
+      <w:pPr>
+        <w:pStyle w:val="BodyText"/>
+        <w:spacing w:before="0" w:after="0"/>
+        <w:rPr/>
+      </w:pPr>
+      <w:r>
+        <w:rPr/>
+      </w:r>
+    </w:p>
+    <w:p>
+      <w:pPr>
+        <w:pStyle w:val="BodyText"/>
+        <w:spacing w:before="0" w:after="0"/>
+        <w:rPr/>
+      </w:pPr>
+      <w:r>
+        <w:rPr/>
+      </w:r>
+    </w:p>
+    <w:p>
+      <w:pPr>
+        <w:pStyle w:val="BodyText"/>
+        <w:spacing w:before="0" w:after="0"/>
+        <w:rPr/>
+      </w:pPr>
+      <w:r>
+        <w:rPr/>
+      </w:r>
+    </w:p>
+    <w:p>
+      <w:pPr>
+        <w:pStyle w:val="BodyText"/>
+        <w:numPr>
+          <w:ilvl w:val="0"/>
+          <w:numId w:val="14"/>
+        </w:numPr>
+        <w:tabs>
+          <w:tab w:val="clear" w:pos="709"/>
+          <w:tab w:val="left" w:pos="0" w:leader="none"/>
+        </w:tabs>
+        <w:spacing w:before="0" w:after="0"/>
+        <w:ind w:hanging="283" w:start="709"/>
+        <w:rPr/>
+      </w:pPr>
+      <w:r>
+        <w:rPr/>
+        <w:t xml:space="preserve">Page Conditions d’Utilisation </w:t>
+      </w:r>
+    </w:p>
+    <w:p>
+      <w:pPr>
+        <w:pStyle w:val="BodyText"/>
+        <w:spacing w:before="0" w:after="0"/>
+        <w:rPr/>
+      </w:pPr>
+      <w:r>
+        <w:rPr/>
+      </w:r>
+    </w:p>
+    <w:p>
+      <w:pPr>
+        <w:pStyle w:val="BodyText"/>
+        <w:spacing w:before="0" w:after="0"/>
+        <w:rPr/>
+      </w:pPr>
+      <w:r>
+        <w:rPr/>
+      </w:r>
+    </w:p>
+    <w:p>
+      <w:pPr>
+        <w:pStyle w:val="BodyText"/>
+        <w:spacing w:before="0" w:after="0"/>
+        <w:rPr/>
+      </w:pPr>
+      <w:r>
+        <w:rPr/>
+      </w:r>
+    </w:p>
+    <w:p>
+      <w:pPr>
+        <w:pStyle w:val="BodyText"/>
+        <w:spacing w:before="0" w:after="0"/>
+        <w:rPr/>
+      </w:pPr>
+      <w:r>
+        <w:rPr/>
+        <w:drawing>
+          <wp:anchor behindDoc="0" distT="0" distB="0" distL="0" distR="0" simplePos="0" locked="0" layoutInCell="0" allowOverlap="1" relativeHeight="4">
+            <wp:simplePos x="0" y="0"/>
+            <wp:positionH relativeFrom="column">
+              <wp:posOffset>335915</wp:posOffset>
+            </wp:positionH>
+            <wp:positionV relativeFrom="paragraph">
+              <wp:posOffset>-3175</wp:posOffset>
+            </wp:positionV>
+            <wp:extent cx="5335270" cy="3694430"/>
+            <wp:effectExtent l="0" t="0" r="0" b="0"/>
+            <wp:wrapSquare wrapText="largest"/>
+            <wp:docPr id="3" name="Image3" descr="" title=""/>
+            <wp:cNvGraphicFramePr>
+              <a:graphicFrameLocks xmlns:a="http://schemas.openxmlformats.org/drawingml/2006/main" noChangeAspect="1"/>
+            </wp:cNvGraphicFramePr>
+            <a:graphic xmlns:a="http://schemas.openxmlformats.org/drawingml/2006/main">
+              <a:graphicData uri="http://schemas.openxmlformats.org/drawingml/2006/picture">
+                <pic:pic xmlns:pic="http://schemas.openxmlformats.org/drawingml/2006/picture">
+                  <pic:nvPicPr>
+                    <pic:cNvPr id="3" name="Image3" descr="" title=""/>
+                    <pic:cNvPicPr>
+                      <a:picLocks noChangeAspect="1" noChangeArrowheads="1"/>
+                    </pic:cNvPicPr>
+                  </pic:nvPicPr>
+                  <pic:blipFill>
+                    <a:blip r:embed="rId4"/>
+                    <a:srcRect l="3132" t="3402" r="9687" b="0"/>
+                    <a:stretch>
+                      <a:fillRect/>
+                    </a:stretch>
+                  </pic:blipFill>
+                  <pic:spPr bwMode="auto">
+                    <a:xfrm>
+                      <a:off x="0" y="0"/>
+                      <a:ext cx="5335270" cy="3694430"/>
+                    </a:xfrm>
+                    <a:prstGeom prst="rect">
+                      <a:avLst/>
+                    </a:prstGeom>
+                  </pic:spPr>
+                </pic:pic>
+              </a:graphicData>
+            </a:graphic>
+          </wp:anchor>
+        </w:drawing>
+      </w:r>
+    </w:p>
+    <w:p>
+      <w:pPr>
+        <w:pStyle w:val="BodyText"/>
+        <w:spacing w:before="0" w:after="0"/>
+        <w:rPr/>
+      </w:pPr>
+      <w:r>
+        <w:rPr/>
+      </w:r>
+    </w:p>
+    <w:p>
+      <w:pPr>
+        <w:pStyle w:val="BodyText"/>
+        <w:spacing w:before="0" w:after="0"/>
+        <w:rPr/>
+      </w:pPr>
+      <w:r>
+        <w:rPr/>
+      </w:r>
+    </w:p>
+    <w:p>
+      <w:pPr>
+        <w:pStyle w:val="BodyText"/>
+        <w:spacing w:before="0" w:after="0"/>
+        <w:rPr/>
+      </w:pPr>
+      <w:r>
+        <w:rPr/>
+      </w:r>
+    </w:p>
+    <w:p>
+      <w:pPr>
+        <w:pStyle w:val="BodyText"/>
+        <w:spacing w:before="0" w:after="0"/>
+        <w:rPr/>
+      </w:pPr>
+      <w:r>
+        <w:rPr/>
+      </w:r>
+    </w:p>
+    <w:p>
+      <w:pPr>
+        <w:pStyle w:val="BodyText"/>
+        <w:spacing w:before="0" w:after="0"/>
+        <w:rPr/>
+      </w:pPr>
+      <w:r>
+        <w:rPr/>
+      </w:r>
+    </w:p>
+    <w:p>
+      <w:pPr>
+        <w:pStyle w:val="BodyText"/>
+        <w:spacing w:before="0" w:after="0"/>
+        <w:rPr/>
+      </w:pPr>
+      <w:r>
+        <w:rPr/>
+      </w:r>
+    </w:p>
+    <w:p>
+      <w:pPr>
+        <w:pStyle w:val="BodyText"/>
+        <w:spacing w:before="0" w:after="0"/>
+        <w:rPr/>
+      </w:pPr>
+      <w:r>
+        <w:rPr/>
+      </w:r>
+    </w:p>
+    <w:p>
+      <w:pPr>
+        <w:pStyle w:val="BodyText"/>
+        <w:spacing w:before="0" w:after="0"/>
+        <w:rPr/>
+      </w:pPr>
+      <w:r>
+        <w:rPr/>
+      </w:r>
+    </w:p>
+    <w:p>
+      <w:pPr>
+        <w:pStyle w:val="BodyText"/>
+        <w:spacing w:before="0" w:after="0"/>
+        <w:rPr/>
+      </w:pPr>
+      <w:r>
+        <w:rPr/>
+      </w:r>
+    </w:p>
+    <w:p>
+      <w:pPr>
+        <w:pStyle w:val="BodyText"/>
+        <w:spacing w:before="0" w:after="0"/>
+        <w:rPr/>
+      </w:pPr>
+      <w:r>
+        <w:rPr/>
+      </w:r>
+    </w:p>
+    <w:p>
+      <w:pPr>
+        <w:pStyle w:val="BodyText"/>
+        <w:numPr>
+          <w:ilvl w:val="0"/>
+          <w:numId w:val="0"/>
+        </w:numPr>
+        <w:ind w:hanging="0" w:start="0"/>
+        <w:rPr/>
+      </w:pPr>
+      <w:r>
+        <w:rPr/>
+      </w:r>
+    </w:p>
+    <w:p>
+      <w:pPr>
+        <w:pStyle w:val="BodyText"/>
+        <w:numPr>
+          <w:ilvl w:val="0"/>
+          <w:numId w:val="14"/>
+        </w:numPr>
+        <w:tabs>
+          <w:tab w:val="clear" w:pos="709"/>
+          <w:tab w:val="left" w:pos="0" w:leader="none"/>
+        </w:tabs>
+        <w:ind w:hanging="283" w:start="709"/>
+        <w:rPr/>
+      </w:pPr>
+      <w:r>
+        <w:rPr/>
+        <w:t xml:space="preserve">Page d’Erreur </w:t>
+      </w:r>
+    </w:p>
+    <w:p>
+      <w:pPr>
+        <w:pStyle w:val="BodyText"/>
+        <w:rPr/>
+      </w:pPr>
+      <w:r>
+        <w:rPr/>
+        <w:drawing>
+          <wp:anchor behindDoc="0" distT="0" distB="0" distL="0" distR="0" simplePos="0" locked="0" layoutInCell="0" allowOverlap="1" relativeHeight="5">
+            <wp:simplePos x="0" y="0"/>
+            <wp:positionH relativeFrom="column">
+              <wp:posOffset>440690</wp:posOffset>
+            </wp:positionH>
+            <wp:positionV relativeFrom="paragraph">
+              <wp:posOffset>635</wp:posOffset>
+            </wp:positionV>
+            <wp:extent cx="5181600" cy="3500120"/>
+            <wp:effectExtent l="0" t="0" r="0" b="0"/>
+            <wp:wrapSquare wrapText="largest"/>
+            <wp:docPr id="4" name="Image4" descr="" title=""/>
+            <wp:cNvGraphicFramePr>
+              <a:graphicFrameLocks xmlns:a="http://schemas.openxmlformats.org/drawingml/2006/main" noChangeAspect="1"/>
+            </wp:cNvGraphicFramePr>
+            <a:graphic xmlns:a="http://schemas.openxmlformats.org/drawingml/2006/main">
+              <a:graphicData uri="http://schemas.openxmlformats.org/drawingml/2006/picture">
+                <pic:pic xmlns:pic="http://schemas.openxmlformats.org/drawingml/2006/picture">
+                  <pic:nvPicPr>
+                    <pic:cNvPr id="4" name="Image4" descr="" title=""/>
+                    <pic:cNvPicPr>
+                      <a:picLocks noChangeAspect="1" noChangeArrowheads="1"/>
+                    </pic:cNvPicPr>
+                  </pic:nvPicPr>
+                  <pic:blipFill>
+                    <a:blip r:embed="rId5"/>
+                    <a:srcRect l="7199" t="0" r="8136" b="8482"/>
+                    <a:stretch>
+                      <a:fillRect/>
+                    </a:stretch>
+                  </pic:blipFill>
+                  <pic:spPr bwMode="auto">
+                    <a:xfrm>
+                      <a:off x="0" y="0"/>
+                      <a:ext cx="5181600" cy="3500120"/>
+                    </a:xfrm>
+                    <a:prstGeom prst="rect">
+                      <a:avLst/>
+                    </a:prstGeom>
+                  </pic:spPr>
+                </pic:pic>
+              </a:graphicData>
+            </a:graphic>
+          </wp:anchor>
+        </w:drawing>
+      </w:r>
+    </w:p>
+    <w:p>
+      <w:pPr>
+        <w:pStyle w:val="BodyText"/>
+        <w:rPr/>
+      </w:pPr>
+      <w:r>
+        <w:rPr/>
+      </w:r>
+    </w:p>
+    <w:p>
+      <w:pPr>
+        <w:pStyle w:val="BodyText"/>
+        <w:rPr/>
+      </w:pPr>
+      <w:r>
+        <w:rPr/>
+      </w:r>
+    </w:p>
+    <w:p>
+      <w:pPr>
+        <w:pStyle w:val="BodyText"/>
+        <w:rPr/>
+      </w:pPr>
+      <w:r>
+        <w:rPr/>
+      </w:r>
+    </w:p>
+    <w:p>
+      <w:pPr>
+        <w:pStyle w:val="BodyText"/>
+        <w:rPr/>
+      </w:pPr>
+      <w:r>
+        <w:rPr/>
+      </w:r>
+    </w:p>
+    <w:p>
+      <w:pPr>
+        <w:pStyle w:val="BodyText"/>
+        <w:rPr/>
+      </w:pPr>
+      <w:r>
+        <w:rPr/>
+      </w:r>
+    </w:p>
+    <w:p>
+      <w:pPr>
+        <w:pStyle w:val="BodyText"/>
+        <w:rPr/>
+      </w:pPr>
+      <w:r>
+        <w:rPr/>
+      </w:r>
+    </w:p>
+    <w:p>
+      <w:pPr>
+        <w:pStyle w:val="BodyText"/>
+        <w:ind w:hanging="0" w:start="0" w:end="0"/>
+        <w:rPr>
+          <w:rStyle w:val="Strong"/>
+        </w:rPr>
+      </w:pPr>
+      <w:r>
+        <w:rPr/>
+      </w:r>
+    </w:p>
+    <w:p>
+      <w:pPr>
+        <w:pStyle w:val="BodyText"/>
+        <w:ind w:hanging="0" w:start="0" w:end="0"/>
+        <w:rPr>
+          <w:rStyle w:val="Strong"/>
+        </w:rPr>
+      </w:pPr>
+      <w:r>
+        <w:rPr/>
+      </w:r>
+    </w:p>
+    <w:p>
+      <w:pPr>
+        <w:pStyle w:val="BodyText"/>
+        <w:ind w:hanging="0" w:start="0" w:end="0"/>
+        <w:rPr>
+          <w:rStyle w:val="Strong"/>
+        </w:rPr>
+      </w:pPr>
+      <w:r>
+        <w:rPr/>
+      </w:r>
+    </w:p>
+    <w:p>
+      <w:pPr>
+        <w:pStyle w:val="BodyText"/>
+        <w:ind w:hanging="0" w:start="0" w:end="0"/>
+        <w:rPr>
+          <w:rStyle w:val="Strong"/>
+        </w:rPr>
+      </w:pPr>
+      <w:r>
+        <w:rPr/>
+      </w:r>
+    </w:p>
+    <w:p>
+      <w:pPr>
+        <w:pStyle w:val="BodyText"/>
+        <w:ind w:hanging="0" w:start="0" w:end="0"/>
+        <w:rPr>
+          <w:rStyle w:val="Strong"/>
+        </w:rPr>
+      </w:pPr>
+      <w:r>
+        <w:rPr/>
+      </w:r>
+    </w:p>
+    <w:p>
+      <w:pPr>
+        <w:pStyle w:val="BodyText"/>
+        <w:ind w:hanging="0" w:start="0" w:end="0"/>
+        <w:rPr>
+          <w:rStyle w:val="Strong"/>
+        </w:rPr>
+      </w:pPr>
+      <w:r>
+        <w:rPr/>
+      </w:r>
+    </w:p>
+    <w:p>
+      <w:pPr>
+        <w:pStyle w:val="BodyText"/>
+        <w:ind w:hanging="0" w:start="0" w:end="0"/>
+        <w:rPr/>
+      </w:pPr>
+      <w:r>
+        <w:rPr>
+          <w:rStyle w:val="Strong"/>
+        </w:rPr>
+        <w:t>3.2 Interface Administration</w:t>
+      </w:r>
+    </w:p>
+    <w:p>
+      <w:pPr>
+        <w:pStyle w:val="BodyText"/>
+        <w:numPr>
+          <w:ilvl w:val="0"/>
+          <w:numId w:val="15"/>
+        </w:numPr>
+        <w:tabs>
+          <w:tab w:val="clear" w:pos="709"/>
+          <w:tab w:val="left" w:pos="0" w:leader="none"/>
+        </w:tabs>
+        <w:ind w:hanging="283" w:start="709"/>
+        <w:rPr/>
+      </w:pPr>
+      <w:r>
+        <w:rPr/>
+        <w:t xml:space="preserve">Tableau de bord Admin </w:t>
+      </w:r>
+    </w:p>
+    <w:p>
+      <w:pPr>
+        <w:pStyle w:val="BodyText"/>
+        <w:rPr/>
+      </w:pPr>
+      <w:r>
+        <w:rPr/>
+      </w:r>
+    </w:p>
+    <w:p>
+      <w:pPr>
+        <w:pStyle w:val="BodyText"/>
+        <w:rPr/>
+      </w:pPr>
+      <w:r>
+        <w:rPr/>
+        <w:drawing>
+          <wp:anchor behindDoc="0" distT="0" distB="0" distL="0" distR="0" simplePos="0" locked="0" layoutInCell="0" allowOverlap="1" relativeHeight="6">
+            <wp:simplePos x="0" y="0"/>
+            <wp:positionH relativeFrom="column">
+              <wp:align>center</wp:align>
+            </wp:positionH>
+            <wp:positionV relativeFrom="paragraph">
+              <wp:posOffset>635</wp:posOffset>
+            </wp:positionV>
+            <wp:extent cx="5392420" cy="2427605"/>
+            <wp:effectExtent l="0" t="0" r="0" b="0"/>
+            <wp:wrapSquare wrapText="largest"/>
+            <wp:docPr id="5" name="Image5" descr="" title=""/>
+            <wp:cNvGraphicFramePr>
+              <a:graphicFrameLocks xmlns:a="http://schemas.openxmlformats.org/drawingml/2006/main" noChangeAspect="1"/>
+            </wp:cNvGraphicFramePr>
+            <a:graphic xmlns:a="http://schemas.openxmlformats.org/drawingml/2006/main">
+              <a:graphicData uri="http://schemas.openxmlformats.org/drawingml/2006/picture">
+                <pic:pic xmlns:pic="http://schemas.openxmlformats.org/drawingml/2006/picture">
+                  <pic:nvPicPr>
+                    <pic:cNvPr id="5" name="Image5" descr="" title=""/>
+                    <pic:cNvPicPr>
+                      <a:picLocks noChangeAspect="1" noChangeArrowheads="1"/>
+                    </pic:cNvPicPr>
+                  </pic:nvPicPr>
+                  <pic:blipFill>
+                    <a:blip r:embed="rId6"/>
+                    <a:srcRect l="0" t="0" r="0" b="15869"/>
+                    <a:stretch>
+                      <a:fillRect/>
+                    </a:stretch>
+                  </pic:blipFill>
+                  <pic:spPr bwMode="auto">
+                    <a:xfrm>
+                      <a:off x="0" y="0"/>
+                      <a:ext cx="5392420" cy="2427605"/>
+                    </a:xfrm>
+                    <a:prstGeom prst="rect">
+                      <a:avLst/>
+                    </a:prstGeom>
+                  </pic:spPr>
+                </pic:pic>
+              </a:graphicData>
+            </a:graphic>
+          </wp:anchor>
+        </w:drawing>
+      </w:r>
+    </w:p>
+    <w:p>
+      <w:pPr>
+        <w:pStyle w:val="BodyText"/>
+        <w:rPr/>
+      </w:pPr>
+      <w:r>
+        <w:rPr/>
+      </w:r>
+    </w:p>
+    <w:p>
+      <w:pPr>
+        <w:pStyle w:val="BodyText"/>
+        <w:rPr/>
+      </w:pPr>
+      <w:r>
+        <w:rPr/>
+      </w:r>
+    </w:p>
+    <w:p>
+      <w:pPr>
+        <w:pStyle w:val="BodyText"/>
+        <w:rPr/>
+      </w:pPr>
+      <w:r>
+        <w:rPr/>
+      </w:r>
+    </w:p>
+    <w:p>
+      <w:pPr>
+        <w:pStyle w:val="BodyText"/>
+        <w:rPr/>
+      </w:pPr>
+      <w:r>
+        <w:rPr/>
+      </w:r>
+    </w:p>
+    <w:p>
+      <w:pPr>
+        <w:pStyle w:val="BodyText"/>
+        <w:rPr/>
+      </w:pPr>
+      <w:r>
+        <w:rPr/>
+      </w:r>
+    </w:p>
+    <w:p>
+      <w:pPr>
+        <w:pStyle w:val="BodyText"/>
+        <w:rPr/>
+      </w:pPr>
+      <w:r>
+        <w:rPr/>
+      </w:r>
+    </w:p>
+    <w:p>
+      <w:pPr>
+        <w:pStyle w:val="BodyText"/>
+        <w:rPr/>
+      </w:pPr>
+      <w:r>
+        <w:rPr/>
+      </w:r>
+    </w:p>
+    <w:p>
+      <w:pPr>
+        <w:pStyle w:val="BodyText"/>
+        <w:rPr/>
+      </w:pPr>
+      <w:r>
+        <w:rPr/>
+      </w:r>
+    </w:p>
+    <w:p>
+      <w:pPr>
+        <w:pStyle w:val="BodyText"/>
+        <w:ind w:hanging="0" w:start="0" w:end="0"/>
+        <w:rPr>
+          <w:rStyle w:val="Strong"/>
+        </w:rPr>
+      </w:pPr>
+      <w:r>
+        <w:rPr/>
+      </w:r>
+    </w:p>
+    <w:p>
+      <w:pPr>
+        <w:pStyle w:val="BodyText"/>
+        <w:ind w:hanging="0" w:start="0" w:end="0"/>
+        <w:rPr/>
+      </w:pPr>
+      <w:r>
+        <w:rPr>
+          <w:rStyle w:val="Strong"/>
+        </w:rPr>
+        <w:t>3.3 Remarques de conception</w:t>
+      </w:r>
+    </w:p>
+    <w:p>
+      <w:pPr>
+        <w:pStyle w:val="BodyText"/>
+        <w:numPr>
+          <w:ilvl w:val="0"/>
+          <w:numId w:val="16"/>
+        </w:numPr>
+        <w:tabs>
+          <w:tab w:val="clear" w:pos="709"/>
+          <w:tab w:val="left" w:pos="0" w:leader="none"/>
+        </w:tabs>
+        <w:spacing w:before="0" w:after="0"/>
+        <w:ind w:hanging="283" w:start="709"/>
+        <w:rPr/>
+      </w:pPr>
+      <w:r>
+        <w:rPr/>
+        <w:t xml:space="preserve">Design responsive (version mobile reportée à une version ultérieure) </w:t>
+      </w:r>
+    </w:p>
+    <w:p>
+      <w:pPr>
+        <w:pStyle w:val="BodyText"/>
+        <w:numPr>
+          <w:ilvl w:val="0"/>
+          <w:numId w:val="16"/>
+        </w:numPr>
+        <w:tabs>
+          <w:tab w:val="clear" w:pos="709"/>
+          <w:tab w:val="left" w:pos="0" w:leader="none"/>
+        </w:tabs>
+        <w:spacing w:before="0" w:after="0"/>
+        <w:ind w:hanging="283" w:start="709"/>
+        <w:rPr/>
+      </w:pPr>
+      <w:r>
+        <w:rPr/>
+        <w:t xml:space="preserve">Palette de couleurs : Bleu institutionnel (#1E3A8A) + Gris clair (#F8FAFC) </w:t>
+      </w:r>
+    </w:p>
+    <w:p>
+      <w:pPr>
+        <w:pStyle w:val="BodyText"/>
+        <w:numPr>
+          <w:ilvl w:val="0"/>
+          <w:numId w:val="16"/>
+        </w:numPr>
+        <w:tabs>
+          <w:tab w:val="clear" w:pos="709"/>
+          <w:tab w:val="left" w:pos="0" w:leader="none"/>
+        </w:tabs>
+        <w:ind w:hanging="283" w:start="709"/>
+        <w:rPr/>
+      </w:pPr>
+      <w:r>
+        <w:rPr/>
+        <w:t xml:space="preserve">Respect des exigences du sujet : page d’accueil personnalisable, multi-langues (prévu), conditions d’utilisation, page de statut. </w:t>
+      </w:r>
+    </w:p>
+    <w:p>
+      <w:pPr>
+        <w:pStyle w:val="BodyText"/>
+        <w:tabs>
+          <w:tab w:val="left" w:pos="709" w:leader="none"/>
+        </w:tabs>
+        <w:bidi w:val="0"/>
+        <w:ind w:hanging="0" w:start="709"/>
+        <w:jc w:val="start"/>
+        <w:rPr/>
+      </w:pPr>
+      <w:r>
+        <w:rPr/>
+      </w:r>
+    </w:p>
+    <w:p>
+      <w:pPr>
+        <w:pStyle w:val="BodyText"/>
+        <w:bidi w:val="0"/>
+        <w:ind w:hanging="0" w:start="0" w:end="0"/>
+        <w:jc w:val="start"/>
+        <w:rPr/>
+      </w:pPr>
+      <w:r>
+        <w:rPr>
+          <w:rStyle w:val="Strong"/>
+        </w:rPr>
+        <w:t>4. Cahier des charges fonctionnel détaillé</w:t>
+      </w:r>
+    </w:p>
+    <w:p>
+      <w:pPr>
+        <w:pStyle w:val="BodyText"/>
+        <w:ind w:hanging="0" w:start="0" w:end="0"/>
+        <w:rPr/>
+      </w:pPr>
+      <w:r>
+        <w:rPr>
+          <w:rStyle w:val="Strong"/>
+        </w:rPr>
+        <w:t>4.1 Exigences fonctionnelles</w:t>
+      </w:r>
+    </w:p>
+    <w:p>
+      <w:pPr>
+        <w:pStyle w:val="BodyText"/>
+        <w:numPr>
+          <w:ilvl w:val="0"/>
+          <w:numId w:val="11"/>
+        </w:numPr>
+        <w:tabs>
+          <w:tab w:val="clear" w:pos="709"/>
+          <w:tab w:val="left" w:pos="0" w:leader="none"/>
+        </w:tabs>
+        <w:spacing w:before="0" w:after="0"/>
+        <w:ind w:hanging="283" w:start="709"/>
+        <w:rPr/>
+      </w:pPr>
+      <w:r>
+        <w:rPr/>
+        <w:t xml:space="preserve">Authentification (nom/prénom + mot de passe, OAuth, SMS optionnel) </w:t>
+      </w:r>
+    </w:p>
+    <w:p>
+      <w:pPr>
+        <w:pStyle w:val="BodyText"/>
+        <w:numPr>
+          <w:ilvl w:val="0"/>
+          <w:numId w:val="11"/>
+        </w:numPr>
+        <w:tabs>
+          <w:tab w:val="clear" w:pos="709"/>
+          <w:tab w:val="left" w:pos="0" w:leader="none"/>
+        </w:tabs>
+        <w:spacing w:before="0" w:after="0"/>
+        <w:ind w:hanging="283" w:start="709"/>
+        <w:rPr/>
+      </w:pPr>
+      <w:r>
+        <w:rPr/>
+        <w:t xml:space="preserve">Gestion des sessions (durée limitée, bande passante, déconnexion automatique) </w:t>
+      </w:r>
+    </w:p>
+    <w:p>
+      <w:pPr>
+        <w:pStyle w:val="BodyText"/>
+        <w:numPr>
+          <w:ilvl w:val="0"/>
+          <w:numId w:val="11"/>
+        </w:numPr>
+        <w:tabs>
+          <w:tab w:val="clear" w:pos="709"/>
+          <w:tab w:val="left" w:pos="0" w:leader="none"/>
+        </w:tabs>
+        <w:spacing w:before="0" w:after="0"/>
+        <w:ind w:hanging="283" w:start="709"/>
+        <w:rPr/>
+      </w:pPr>
+      <w:r>
+        <w:rPr/>
+        <w:t xml:space="preserve">Interface utilisateur responsive et multi-langues </w:t>
+      </w:r>
+    </w:p>
+    <w:p>
+      <w:pPr>
+        <w:pStyle w:val="BodyText"/>
+        <w:numPr>
+          <w:ilvl w:val="0"/>
+          <w:numId w:val="11"/>
+        </w:numPr>
+        <w:tabs>
+          <w:tab w:val="clear" w:pos="709"/>
+          <w:tab w:val="left" w:pos="0" w:leader="none"/>
+        </w:tabs>
+        <w:ind w:hanging="283" w:start="709"/>
+        <w:rPr/>
+      </w:pPr>
+      <w:r>
+        <w:rPr/>
+        <w:t xml:space="preserve">Interface d’administration complète </w:t>
+      </w:r>
+    </w:p>
+    <w:p>
+      <w:pPr>
+        <w:pStyle w:val="BodyText"/>
+        <w:ind w:hanging="0" w:start="0" w:end="0"/>
+        <w:rPr/>
+      </w:pPr>
+      <w:r>
+        <w:rPr>
+          <w:rStyle w:val="Strong"/>
+        </w:rPr>
+        <w:t>4.2 Exigences non fonctionnelles</w:t>
+      </w:r>
+    </w:p>
+    <w:p>
+      <w:pPr>
+        <w:pStyle w:val="BodyText"/>
+        <w:numPr>
+          <w:ilvl w:val="0"/>
+          <w:numId w:val="12"/>
+        </w:numPr>
+        <w:tabs>
+          <w:tab w:val="clear" w:pos="709"/>
+          <w:tab w:val="left" w:pos="0" w:leader="none"/>
+        </w:tabs>
+        <w:spacing w:before="0" w:after="0"/>
+        <w:ind w:hanging="283" w:start="709"/>
+        <w:rPr/>
+      </w:pPr>
+      <w:r>
+        <w:rPr/>
+        <w:t xml:space="preserve">Sécurité : HTTPS, protection MITM, hashage Argon2 </w:t>
+      </w:r>
+    </w:p>
+    <w:p>
+      <w:pPr>
+        <w:pStyle w:val="BodyText"/>
+        <w:numPr>
+          <w:ilvl w:val="0"/>
+          <w:numId w:val="12"/>
+        </w:numPr>
+        <w:tabs>
+          <w:tab w:val="clear" w:pos="709"/>
+          <w:tab w:val="left" w:pos="0" w:leader="none"/>
+        </w:tabs>
+        <w:spacing w:before="0" w:after="0"/>
+        <w:ind w:hanging="283" w:start="709"/>
+        <w:rPr/>
+      </w:pPr>
+      <w:r>
+        <w:rPr/>
+        <w:t xml:space="preserve">Performance : temps de réponse &lt; 2s </w:t>
+      </w:r>
+    </w:p>
+    <w:p>
+      <w:pPr>
+        <w:pStyle w:val="BodyText"/>
+        <w:numPr>
+          <w:ilvl w:val="0"/>
+          <w:numId w:val="12"/>
+        </w:numPr>
+        <w:tabs>
+          <w:tab w:val="clear" w:pos="709"/>
+          <w:tab w:val="left" w:pos="0" w:leader="none"/>
+        </w:tabs>
+        <w:ind w:hanging="283" w:start="709"/>
+        <w:rPr/>
+      </w:pPr>
+      <w:r>
+        <w:rPr/>
+        <w:t xml:space="preserve">Conformité : RGPD + législation locale </w:t>
+      </w:r>
+    </w:p>
+    <w:p>
+      <w:pPr>
+        <w:pStyle w:val="BodyText"/>
+        <w:ind w:hanging="0" w:start="0" w:end="0"/>
+        <w:rPr/>
+      </w:pPr>
+      <w:r>
+        <w:rPr>
+          <w:rStyle w:val="Strong"/>
+        </w:rPr>
+        <w:t>4.3 Use Cases principaux</w:t>
+      </w:r>
+    </w:p>
+    <w:p>
+      <w:pPr>
+        <w:pStyle w:val="BodyText"/>
+        <w:numPr>
+          <w:ilvl w:val="0"/>
+          <w:numId w:val="13"/>
+        </w:numPr>
+        <w:tabs>
+          <w:tab w:val="clear" w:pos="709"/>
+          <w:tab w:val="left" w:pos="0" w:leader="none"/>
+        </w:tabs>
+        <w:spacing w:before="0" w:after="0"/>
+        <w:ind w:hanging="283" w:start="709"/>
+        <w:rPr/>
+      </w:pPr>
+      <w:r>
+        <w:rPr/>
+        <w:t xml:space="preserve">Utilisateur se connecte au WiFi → redirection vers portail </w:t>
+      </w:r>
+    </w:p>
+    <w:p>
+      <w:pPr>
+        <w:pStyle w:val="BodyText"/>
+        <w:numPr>
+          <w:ilvl w:val="0"/>
+          <w:numId w:val="13"/>
+        </w:numPr>
+        <w:tabs>
+          <w:tab w:val="clear" w:pos="709"/>
+          <w:tab w:val="left" w:pos="0" w:leader="none"/>
+        </w:tabs>
+        <w:spacing w:before="0" w:after="0"/>
+        <w:ind w:hanging="283" w:start="709"/>
+        <w:rPr/>
+      </w:pPr>
+      <w:r>
+        <w:rPr/>
+        <w:t xml:space="preserve">Authentification réussie → accès internet + création session </w:t>
+      </w:r>
+    </w:p>
+    <w:p>
+      <w:pPr>
+        <w:pStyle w:val="BodyText"/>
+        <w:numPr>
+          <w:ilvl w:val="0"/>
+          <w:numId w:val="13"/>
+        </w:numPr>
+        <w:tabs>
+          <w:tab w:val="clear" w:pos="709"/>
+          <w:tab w:val="left" w:pos="0" w:leader="none"/>
+        </w:tabs>
+        <w:spacing w:before="0" w:after="0"/>
+        <w:ind w:hanging="283" w:start="709"/>
+        <w:rPr/>
+      </w:pPr>
+      <w:r>
+        <w:rPr/>
+        <w:t xml:space="preserve">Administrateur consulte les sessions actives </w:t>
+      </w:r>
+    </w:p>
+    <w:p>
+      <w:pPr>
+        <w:pStyle w:val="BodyText"/>
+        <w:numPr>
+          <w:ilvl w:val="0"/>
+          <w:numId w:val="13"/>
+        </w:numPr>
+        <w:tabs>
+          <w:tab w:val="clear" w:pos="709"/>
+          <w:tab w:val="left" w:pos="0" w:leader="none"/>
+        </w:tabs>
+        <w:ind w:hanging="283" w:start="709"/>
+        <w:rPr/>
+      </w:pPr>
+      <w:r>
+        <w:rPr/>
+        <w:t xml:space="preserve">Déconnexion manuelle ou automatique </w:t>
+      </w:r>
+    </w:p>
+    <w:p>
+      <w:pPr>
+        <w:pStyle w:val="BodyText"/>
+        <w:ind w:hanging="0" w:start="0" w:end="0"/>
+        <w:rPr/>
+      </w:pPr>
+      <w:r>
+        <w:rPr>
+          <w:rStyle w:val="Strong"/>
+        </w:rPr>
+        <w:t>4.4 Diagramme de flux</w:t>
+      </w:r>
+      <w:r>
+        <w:rPr/>
+        <w:t xml:space="preserve"> (tu as déjà FLUX.MD → insère l’image)</w:t>
+      </w:r>
+    </w:p>
+    <w:p>
+      <w:pPr>
+        <w:pStyle w:val="BodyText"/>
+        <w:ind w:hanging="0" w:start="0" w:end="0"/>
+        <w:rPr/>
+      </w:pPr>
+      <w:r>
+        <w:rPr/>
+      </w:r>
+    </w:p>
+    <w:p>
+      <w:pPr>
+        <w:pStyle w:val="BodyText"/>
+        <w:ind w:hanging="0" w:start="0" w:end="0"/>
+        <w:rPr/>
+      </w:pPr>
+      <w:r>
+        <w:rPr/>
+      </w:r>
+    </w:p>
+    <w:p>
+      <w:pPr>
+        <w:pStyle w:val="BodyText"/>
+        <w:ind w:hanging="0" w:start="0" w:end="0"/>
+        <w:rPr/>
+      </w:pPr>
+      <w:r>
+        <w:rPr/>
+      </w:r>
+    </w:p>
+    <w:p>
+      <w:pPr>
+        <w:pStyle w:val="BodyText"/>
+        <w:ind w:hanging="0" w:start="0" w:end="0"/>
+        <w:rPr/>
+      </w:pPr>
+      <w:r>
+        <w:rPr/>
+      </w:r>
+    </w:p>
+    <w:p>
+      <w:pPr>
+        <w:pStyle w:val="BodyText"/>
+        <w:ind w:hanging="0" w:start="0" w:end="0"/>
+        <w:rPr/>
+      </w:pPr>
+      <w:r>
+        <w:rPr/>
+        <w:drawing>
+          <wp:anchor behindDoc="0" distT="0" distB="0" distL="0" distR="0" simplePos="0" locked="0" layoutInCell="0" allowOverlap="1" relativeHeight="7">
+            <wp:simplePos x="0" y="0"/>
+            <wp:positionH relativeFrom="column">
+              <wp:align>center</wp:align>
+            </wp:positionH>
+            <wp:positionV relativeFrom="paragraph">
+              <wp:posOffset>635</wp:posOffset>
+            </wp:positionV>
+            <wp:extent cx="6120130" cy="3350260"/>
+            <wp:effectExtent l="0" t="0" r="0" b="0"/>
+            <wp:wrapSquare wrapText="largest"/>
+            <wp:docPr id="6" name="Image6" descr="" title=""/>
+            <wp:cNvGraphicFramePr>
+              <a:graphicFrameLocks xmlns:a="http://schemas.openxmlformats.org/drawingml/2006/main" noChangeAspect="1"/>
+            </wp:cNvGraphicFramePr>
+            <a:graphic xmlns:a="http://schemas.openxmlformats.org/drawingml/2006/main">
+              <a:graphicData uri="http://schemas.openxmlformats.org/drawingml/2006/picture">
+                <pic:pic xmlns:pic="http://schemas.openxmlformats.org/drawingml/2006/picture">
+                  <pic:nvPicPr>
+                    <pic:cNvPr id="6" name="Image6" descr="" title=""/>
+                    <pic:cNvPicPr>
+                      <a:picLocks noChangeAspect="1" noChangeArrowheads="1"/>
+                    </pic:cNvPicPr>
+                  </pic:nvPicPr>
+                  <pic:blipFill>
+                    <a:blip r:embed="rId7"/>
+                    <a:srcRect l="0" t="0" r="0" b="2623"/>
+                    <a:stretch>
+                      <a:fillRect/>
+                    </a:stretch>
+                  </pic:blipFill>
+                  <pic:spPr bwMode="auto">
+                    <a:xfrm>
+                      <a:off x="0" y="0"/>
+                      <a:ext cx="6120130" cy="3350260"/>
+                    </a:xfrm>
+                    <a:prstGeom prst="rect">
+                      <a:avLst/>
+                    </a:prstGeom>
+                  </pic:spPr>
+                </pic:pic>
+              </a:graphicData>
+            </a:graphic>
+          </wp:anchor>
+        </w:drawing>
+        <w:drawing>
+          <wp:anchor behindDoc="0" distT="0" distB="0" distL="0" distR="0" simplePos="0" locked="0" layoutInCell="0" allowOverlap="1" relativeHeight="8">
+            <wp:simplePos x="0" y="0"/>
+            <wp:positionH relativeFrom="column">
+              <wp:posOffset>0</wp:posOffset>
+            </wp:positionH>
+            <wp:positionV relativeFrom="paragraph">
+              <wp:posOffset>3349625</wp:posOffset>
+            </wp:positionV>
+            <wp:extent cx="6120130" cy="3018155"/>
+            <wp:effectExtent l="0" t="0" r="0" b="0"/>
+            <wp:wrapSquare wrapText="largest"/>
+            <wp:docPr id="7" name="Image7" descr="" title=""/>
+            <wp:cNvGraphicFramePr>
+              <a:graphicFrameLocks xmlns:a="http://schemas.openxmlformats.org/drawingml/2006/main" noChangeAspect="1"/>
+            </wp:cNvGraphicFramePr>
+            <a:graphic xmlns:a="http://schemas.openxmlformats.org/drawingml/2006/main">
+              <a:graphicData uri="http://schemas.openxmlformats.org/drawingml/2006/picture">
+                <pic:pic xmlns:pic="http://schemas.openxmlformats.org/drawingml/2006/picture">
+                  <pic:nvPicPr>
+                    <pic:cNvPr id="7" name="Image7" descr="" title=""/>
+                    <pic:cNvPicPr>
+                      <a:picLocks noChangeAspect="1" noChangeArrowheads="1"/>
+                    </pic:cNvPicPr>
+                  </pic:nvPicPr>
+                  <pic:blipFill>
+                    <a:blip r:embed="rId8"/>
+                    <a:srcRect l="0" t="12274" r="0" b="0"/>
+                    <a:stretch>
+                      <a:fillRect/>
+                    </a:stretch>
+                  </pic:blipFill>
+                  <pic:spPr bwMode="auto">
+                    <a:xfrm>
+                      <a:off x="0" y="0"/>
+                      <a:ext cx="6120130" cy="3018155"/>
+                    </a:xfrm>
+                    <a:prstGeom prst="rect">
+                      <a:avLst/>
+                    </a:prstGeom>
+                  </pic:spPr>
+                </pic:pic>
+              </a:graphicData>
+            </a:graphic>
+          </wp:anchor>
+        </w:drawing>
+      </w:r>
+    </w:p>
+    <w:p>
+      <w:pPr>
         <w:pStyle w:val="Normal"/>
         <w:bidi w:val="0"/>
         <w:jc w:val="start"/>
@@ -1250,8 +2850,366 @@
         <w:rPr/>
       </w:r>
     </w:p>
+    <w:p>
+      <w:pPr>
+        <w:pStyle w:val="Normal"/>
+        <w:bidi w:val="0"/>
+        <w:jc w:val="start"/>
+        <w:rPr/>
+      </w:pPr>
+      <w:r>
+        <w:rPr/>
+      </w:r>
+    </w:p>
+    <w:p>
+      <w:pPr>
+        <w:pStyle w:val="Normal"/>
+        <w:bidi w:val="0"/>
+        <w:jc w:val="start"/>
+        <w:rPr/>
+      </w:pPr>
+      <w:r>
+        <w:rPr/>
+      </w:r>
+    </w:p>
+    <w:p>
+      <w:pPr>
+        <w:pStyle w:val="Normal"/>
+        <w:bidi w:val="0"/>
+        <w:jc w:val="start"/>
+        <w:rPr/>
+      </w:pPr>
+      <w:r>
+        <w:rPr/>
+      </w:r>
+    </w:p>
+    <w:p>
+      <w:pPr>
+        <w:pStyle w:val="Normal"/>
+        <w:bidi w:val="0"/>
+        <w:jc w:val="start"/>
+        <w:rPr/>
+      </w:pPr>
+      <w:r>
+        <w:rPr/>
+      </w:r>
+    </w:p>
+    <w:p>
+      <w:pPr>
+        <w:pStyle w:val="Normal"/>
+        <w:bidi w:val="0"/>
+        <w:jc w:val="start"/>
+        <w:rPr/>
+      </w:pPr>
+      <w:r>
+        <w:rPr/>
+      </w:r>
+    </w:p>
+    <w:p>
+      <w:pPr>
+        <w:pStyle w:val="Normal"/>
+        <w:bidi w:val="0"/>
+        <w:jc w:val="start"/>
+        <w:rPr/>
+      </w:pPr>
+      <w:r>
+        <w:rPr/>
+        <w:drawing>
+          <wp:anchor behindDoc="0" distT="0" distB="0" distL="0" distR="0" simplePos="0" locked="0" layoutInCell="0" allowOverlap="1" relativeHeight="9">
+            <wp:simplePos x="0" y="0"/>
+            <wp:positionH relativeFrom="column">
+              <wp:posOffset>0</wp:posOffset>
+            </wp:positionH>
+            <wp:positionV relativeFrom="paragraph">
+              <wp:posOffset>425450</wp:posOffset>
+            </wp:positionV>
+            <wp:extent cx="6120130" cy="2924175"/>
+            <wp:effectExtent l="0" t="0" r="0" b="0"/>
+            <wp:wrapSquare wrapText="largest"/>
+            <wp:docPr id="8" name="Image8" descr="" title=""/>
+            <wp:cNvGraphicFramePr>
+              <a:graphicFrameLocks xmlns:a="http://schemas.openxmlformats.org/drawingml/2006/main" noChangeAspect="1"/>
+            </wp:cNvGraphicFramePr>
+            <a:graphic xmlns:a="http://schemas.openxmlformats.org/drawingml/2006/main">
+              <a:graphicData uri="http://schemas.openxmlformats.org/drawingml/2006/picture">
+                <pic:pic xmlns:pic="http://schemas.openxmlformats.org/drawingml/2006/picture">
+                  <pic:nvPicPr>
+                    <pic:cNvPr id="8" name="Image8" descr="" title=""/>
+                    <pic:cNvPicPr>
+                      <a:picLocks noChangeAspect="1" noChangeArrowheads="1"/>
+                    </pic:cNvPicPr>
+                  </pic:nvPicPr>
+                  <pic:blipFill>
+                    <a:blip r:embed="rId9"/>
+                    <a:srcRect l="0" t="12362" r="0" b="2638"/>
+                    <a:stretch>
+                      <a:fillRect/>
+                    </a:stretch>
+                  </pic:blipFill>
+                  <pic:spPr bwMode="auto">
+                    <a:xfrm>
+                      <a:off x="0" y="0"/>
+                      <a:ext cx="6120130" cy="2924175"/>
+                    </a:xfrm>
+                    <a:prstGeom prst="rect">
+                      <a:avLst/>
+                    </a:prstGeom>
+                  </pic:spPr>
+                </pic:pic>
+              </a:graphicData>
+            </a:graphic>
+          </wp:anchor>
+        </w:drawing>
+      </w:r>
+    </w:p>
+    <w:p>
+      <w:pPr>
+        <w:pStyle w:val="Normal"/>
+        <w:bidi w:val="0"/>
+        <w:jc w:val="start"/>
+        <w:rPr/>
+      </w:pPr>
+      <w:r>
+        <w:rPr/>
+      </w:r>
+    </w:p>
+    <w:p>
+      <w:pPr>
+        <w:pStyle w:val="Normal"/>
+        <w:bidi w:val="0"/>
+        <w:jc w:val="start"/>
+        <w:rPr/>
+      </w:pPr>
+      <w:r>
+        <w:rPr/>
+        <w:drawing>
+          <wp:anchor behindDoc="0" distT="0" distB="0" distL="0" distR="0" simplePos="0" locked="0" layoutInCell="0" allowOverlap="1" relativeHeight="10">
+            <wp:simplePos x="0" y="0"/>
+            <wp:positionH relativeFrom="column">
+              <wp:posOffset>0</wp:posOffset>
+            </wp:positionH>
+            <wp:positionV relativeFrom="paragraph">
+              <wp:posOffset>2998470</wp:posOffset>
+            </wp:positionV>
+            <wp:extent cx="6120130" cy="1036320"/>
+            <wp:effectExtent l="0" t="0" r="0" b="0"/>
+            <wp:wrapSquare wrapText="largest"/>
+            <wp:docPr id="9" name="Image9" descr="" title=""/>
+            <wp:cNvGraphicFramePr>
+              <a:graphicFrameLocks xmlns:a="http://schemas.openxmlformats.org/drawingml/2006/main" noChangeAspect="1"/>
+            </wp:cNvGraphicFramePr>
+            <a:graphic xmlns:a="http://schemas.openxmlformats.org/drawingml/2006/main">
+              <a:graphicData uri="http://schemas.openxmlformats.org/drawingml/2006/picture">
+                <pic:pic xmlns:pic="http://schemas.openxmlformats.org/drawingml/2006/picture">
+                  <pic:nvPicPr>
+                    <pic:cNvPr id="9" name="Image9" descr="" title=""/>
+                    <pic:cNvPicPr>
+                      <a:picLocks noChangeAspect="1" noChangeArrowheads="1"/>
+                    </pic:cNvPicPr>
+                  </pic:nvPicPr>
+                  <pic:blipFill>
+                    <a:blip r:embed="rId10"/>
+                    <a:srcRect l="0" t="69897" r="0" b="-20"/>
+                    <a:stretch>
+                      <a:fillRect/>
+                    </a:stretch>
+                  </pic:blipFill>
+                  <pic:spPr bwMode="auto">
+                    <a:xfrm>
+                      <a:off x="0" y="0"/>
+                      <a:ext cx="6120130" cy="1036320"/>
+                    </a:xfrm>
+                    <a:prstGeom prst="rect">
+                      <a:avLst/>
+                    </a:prstGeom>
+                  </pic:spPr>
+                </pic:pic>
+              </a:graphicData>
+            </a:graphic>
+          </wp:anchor>
+        </w:drawing>
+      </w:r>
+    </w:p>
+    <w:p>
+      <w:pPr>
+        <w:pStyle w:val="Normal"/>
+        <w:bidi w:val="0"/>
+        <w:jc w:val="start"/>
+        <w:rPr/>
+      </w:pPr>
+      <w:r>
+        <w:rPr/>
+      </w:r>
+    </w:p>
+    <w:p>
+      <w:pPr>
+        <w:pStyle w:val="Normal"/>
+        <w:bidi w:val="0"/>
+        <w:jc w:val="start"/>
+        <w:rPr/>
+      </w:pPr>
+      <w:r>
+        <w:rPr/>
+      </w:r>
+    </w:p>
+    <w:p>
+      <w:pPr>
+        <w:pStyle w:val="Normal"/>
+        <w:bidi w:val="0"/>
+        <w:jc w:val="start"/>
+        <w:rPr/>
+      </w:pPr>
+      <w:r>
+        <w:rPr/>
+      </w:r>
+    </w:p>
+    <w:p>
+      <w:pPr>
+        <w:pStyle w:val="Normal"/>
+        <w:bidi w:val="0"/>
+        <w:jc w:val="start"/>
+        <w:rPr/>
+      </w:pPr>
+      <w:r>
+        <w:rPr/>
+      </w:r>
+    </w:p>
+    <w:p>
+      <w:pPr>
+        <w:pStyle w:val="Normal"/>
+        <w:bidi w:val="0"/>
+        <w:jc w:val="start"/>
+        <w:rPr/>
+      </w:pPr>
+      <w:r>
+        <w:rPr/>
+      </w:r>
+    </w:p>
+    <w:p>
+      <w:pPr>
+        <w:pStyle w:val="Normal"/>
+        <w:bidi w:val="0"/>
+        <w:jc w:val="start"/>
+        <w:rPr/>
+      </w:pPr>
+      <w:r>
+        <w:rPr/>
+      </w:r>
+    </w:p>
+    <w:p>
+      <w:pPr>
+        <w:pStyle w:val="Normal"/>
+        <w:bidi w:val="0"/>
+        <w:jc w:val="start"/>
+        <w:rPr/>
+      </w:pPr>
+      <w:r>
+        <w:rPr/>
+      </w:r>
+    </w:p>
+    <w:p>
+      <w:pPr>
+        <w:pStyle w:val="Normal"/>
+        <w:bidi w:val="0"/>
+        <w:jc w:val="start"/>
+        <w:rPr/>
+      </w:pPr>
+      <w:r>
+        <w:rPr/>
+      </w:r>
+    </w:p>
+    <w:p>
+      <w:pPr>
+        <w:pStyle w:val="Normal"/>
+        <w:bidi w:val="0"/>
+        <w:jc w:val="start"/>
+        <w:rPr/>
+      </w:pPr>
+      <w:r>
+        <w:rPr/>
+      </w:r>
+    </w:p>
+    <w:p>
+      <w:pPr>
+        <w:pStyle w:val="Normal"/>
+        <w:bidi w:val="0"/>
+        <w:jc w:val="start"/>
+        <w:rPr/>
+      </w:pPr>
+      <w:r>
+        <w:rPr/>
+      </w:r>
+    </w:p>
+    <w:p>
+      <w:pPr>
+        <w:pStyle w:val="Normal"/>
+        <w:bidi w:val="0"/>
+        <w:jc w:val="start"/>
+        <w:rPr/>
+      </w:pPr>
+      <w:r>
+        <w:rPr/>
+      </w:r>
+    </w:p>
+    <w:p>
+      <w:pPr>
+        <w:pStyle w:val="Normal"/>
+        <w:bidi w:val="0"/>
+        <w:jc w:val="start"/>
+        <w:rPr/>
+      </w:pPr>
+      <w:r>
+        <w:rPr/>
+      </w:r>
+    </w:p>
+    <w:p>
+      <w:pPr>
+        <w:pStyle w:val="Normal"/>
+        <w:bidi w:val="0"/>
+        <w:jc w:val="start"/>
+        <w:rPr/>
+      </w:pPr>
+      <w:r>
+        <w:rPr/>
+      </w:r>
+    </w:p>
+    <w:p>
+      <w:pPr>
+        <w:pStyle w:val="Normal"/>
+        <w:bidi w:val="0"/>
+        <w:jc w:val="start"/>
+        <w:rPr/>
+      </w:pPr>
+      <w:r>
+        <w:rPr/>
+      </w:r>
+    </w:p>
+    <w:p>
+      <w:pPr>
+        <w:pStyle w:val="Normal"/>
+        <w:bidi w:val="0"/>
+        <w:jc w:val="start"/>
+        <w:rPr/>
+      </w:pPr>
+      <w:r>
+        <w:rPr/>
+      </w:r>
+    </w:p>
+    <w:p>
+      <w:pPr>
+        <w:pStyle w:val="Normal"/>
+        <w:bidi w:val="0"/>
+        <w:jc w:val="start"/>
+        <w:rPr/>
+      </w:pPr>
+      <w:r>
+        <w:rPr/>
+      </w:r>
+    </w:p>
     <w:sectPr>
-      <w:headerReference w:type="default" r:id="rId2"/>
+      <w:headerReference w:type="even" r:id="rId11"/>
+      <w:headerReference w:type="default" r:id="rId12"/>
+      <w:headerReference w:type="first" r:id="rId13"/>
       <w:type w:val="nextPage"/>
       <w:pgSz w:w="11906" w:h="16838"/>
       <w:pgMar w:left="1134" w:right="1134" w:gutter="0" w:header="1134" w:top="1693" w:footer="0" w:bottom="1134"/>
@@ -1273,6 +3231,38 @@
     </w:pPr>
     <w:r>
       <w:rPr/>
+    </w:r>
+  </w:p>
+</w:hdr>
+</file>
+
+<file path=word/header2.xml><?xml version="1.0" encoding="utf-8"?>
+<w:hdr xmlns:o="urn:schemas-microsoft-com:office:office" xmlns:r="http://schemas.openxmlformats.org/officeDocument/2006/relationships" xmlns:v="urn:schemas-microsoft-com:vml" xmlns:w="http://schemas.openxmlformats.org/wordprocessingml/2006/main" xmlns:w10="urn:schemas-microsoft-com:office:word" xmlns:wp="http://schemas.openxmlformats.org/drawingml/2006/wordprocessingDrawing" xmlns:wps="http://schemas.microsoft.com/office/word/2010/wordprocessingShape" xmlns:wpg="http://schemas.microsoft.com/office/word/2010/wordprocessingGroup" xmlns:mc="http://schemas.openxmlformats.org/markup-compatibility/2006" xmlns:wp14="http://schemas.microsoft.com/office/word/2010/wordprocessingDrawing" xmlns:w14="http://schemas.microsoft.com/office/word/2010/wordml" xmlns:w15="http://schemas.microsoft.com/office/word/2012/wordml" mc:Ignorable="w14 wp14 w15">
+  <w:p>
+    <w:pPr>
+      <w:pStyle w:val="Header"/>
+      <w:rPr/>
+    </w:pPr>
+    <w:r>
+      <w:rPr/>
+      <w:t>Université  Assane SECK de Zigunichor</w:t>
+      <w:tab/>
+      <w:tab/>
+      <w:t>Année académique 2025/2024</w:t>
+    </w:r>
+  </w:p>
+</w:hdr>
+</file>
+
+<file path=word/header3.xml><?xml version="1.0" encoding="utf-8"?>
+<w:hdr xmlns:o="urn:schemas-microsoft-com:office:office" xmlns:r="http://schemas.openxmlformats.org/officeDocument/2006/relationships" xmlns:v="urn:schemas-microsoft-com:vml" xmlns:w="http://schemas.openxmlformats.org/wordprocessingml/2006/main" xmlns:w10="urn:schemas-microsoft-com:office:word" xmlns:wp="http://schemas.openxmlformats.org/drawingml/2006/wordprocessingDrawing" xmlns:wps="http://schemas.microsoft.com/office/word/2010/wordprocessingShape" xmlns:wpg="http://schemas.microsoft.com/office/word/2010/wordprocessingGroup" xmlns:mc="http://schemas.openxmlformats.org/markup-compatibility/2006" xmlns:wp14="http://schemas.microsoft.com/office/word/2010/wordprocessingDrawing" xmlns:w14="http://schemas.microsoft.com/office/word/2010/wordml" xmlns:w15="http://schemas.microsoft.com/office/word/2012/wordml" mc:Ignorable="w14 wp14 w15">
+  <w:p>
+    <w:pPr>
+      <w:pStyle w:val="Header"/>
+      <w:rPr/>
+    </w:pPr>
+    <w:r>
+      <w:rPr/>
       <w:t>Université  Assane SECK de Zigunichor</w:t>
       <w:tab/>
       <w:tab/>
@@ -2655,6 +4645,810 @@
     </w:lvl>
   </w:abstractNum>
   <w:abstractNum w:abstractNumId="11">
+    <w:lvl w:ilvl="0">
+      <w:start w:val="1"/>
+      <w:numFmt w:val="bullet"/>
+      <w:lvlText w:val=""/>
+      <w:lvlJc w:val="start"/>
+      <w:pPr>
+        <w:tabs>
+          <w:tab w:val="num" w:pos="709"/>
+        </w:tabs>
+        <w:ind w:start="709" w:hanging="283"/>
+      </w:pPr>
+      <w:rPr>
+        <w:rFonts w:ascii="Symbol" w:hAnsi="Symbol" w:cs="Symbol" w:hint="default"/>
+      </w:rPr>
+    </w:lvl>
+    <w:lvl w:ilvl="1">
+      <w:start w:val="1"/>
+      <w:numFmt w:val="bullet"/>
+      <w:lvlText w:val=""/>
+      <w:lvlJc w:val="start"/>
+      <w:pPr>
+        <w:tabs>
+          <w:tab w:val="num" w:pos="1418"/>
+        </w:tabs>
+        <w:ind w:start="1418" w:hanging="283"/>
+      </w:pPr>
+      <w:rPr>
+        <w:rFonts w:ascii="Symbol" w:hAnsi="Symbol" w:cs="Symbol" w:hint="default"/>
+      </w:rPr>
+    </w:lvl>
+    <w:lvl w:ilvl="2">
+      <w:start w:val="1"/>
+      <w:numFmt w:val="bullet"/>
+      <w:lvlText w:val=""/>
+      <w:lvlJc w:val="start"/>
+      <w:pPr>
+        <w:tabs>
+          <w:tab w:val="num" w:pos="2127"/>
+        </w:tabs>
+        <w:ind w:start="2127" w:hanging="283"/>
+      </w:pPr>
+      <w:rPr>
+        <w:rFonts w:ascii="Symbol" w:hAnsi="Symbol" w:cs="Symbol" w:hint="default"/>
+      </w:rPr>
+    </w:lvl>
+    <w:lvl w:ilvl="3">
+      <w:start w:val="1"/>
+      <w:numFmt w:val="bullet"/>
+      <w:lvlText w:val=""/>
+      <w:lvlJc w:val="start"/>
+      <w:pPr>
+        <w:tabs>
+          <w:tab w:val="num" w:pos="2836"/>
+        </w:tabs>
+        <w:ind w:start="2836" w:hanging="283"/>
+      </w:pPr>
+      <w:rPr>
+        <w:rFonts w:ascii="Symbol" w:hAnsi="Symbol" w:cs="Symbol" w:hint="default"/>
+      </w:rPr>
+    </w:lvl>
+    <w:lvl w:ilvl="4">
+      <w:start w:val="1"/>
+      <w:numFmt w:val="bullet"/>
+      <w:lvlText w:val=""/>
+      <w:lvlJc w:val="start"/>
+      <w:pPr>
+        <w:tabs>
+          <w:tab w:val="num" w:pos="3545"/>
+        </w:tabs>
+        <w:ind w:start="3545" w:hanging="283"/>
+      </w:pPr>
+      <w:rPr>
+        <w:rFonts w:ascii="Symbol" w:hAnsi="Symbol" w:cs="Symbol" w:hint="default"/>
+      </w:rPr>
+    </w:lvl>
+    <w:lvl w:ilvl="5">
+      <w:start w:val="1"/>
+      <w:numFmt w:val="bullet"/>
+      <w:lvlText w:val=""/>
+      <w:lvlJc w:val="start"/>
+      <w:pPr>
+        <w:tabs>
+          <w:tab w:val="num" w:pos="4254"/>
+        </w:tabs>
+        <w:ind w:start="4254" w:hanging="283"/>
+      </w:pPr>
+      <w:rPr>
+        <w:rFonts w:ascii="Symbol" w:hAnsi="Symbol" w:cs="Symbol" w:hint="default"/>
+      </w:rPr>
+    </w:lvl>
+    <w:lvl w:ilvl="6">
+      <w:start w:val="1"/>
+      <w:numFmt w:val="bullet"/>
+      <w:lvlText w:val=""/>
+      <w:lvlJc w:val="start"/>
+      <w:pPr>
+        <w:tabs>
+          <w:tab w:val="num" w:pos="4963"/>
+        </w:tabs>
+        <w:ind w:start="4963" w:hanging="283"/>
+      </w:pPr>
+      <w:rPr>
+        <w:rFonts w:ascii="Symbol" w:hAnsi="Symbol" w:cs="Symbol" w:hint="default"/>
+      </w:rPr>
+    </w:lvl>
+    <w:lvl w:ilvl="7">
+      <w:start w:val="1"/>
+      <w:numFmt w:val="bullet"/>
+      <w:lvlText w:val=""/>
+      <w:lvlJc w:val="start"/>
+      <w:pPr>
+        <w:tabs>
+          <w:tab w:val="num" w:pos="5672"/>
+        </w:tabs>
+        <w:ind w:start="5672" w:hanging="283"/>
+      </w:pPr>
+      <w:rPr>
+        <w:rFonts w:ascii="Symbol" w:hAnsi="Symbol" w:cs="Symbol" w:hint="default"/>
+      </w:rPr>
+    </w:lvl>
+    <w:lvl w:ilvl="8">
+      <w:start w:val="1"/>
+      <w:numFmt w:val="bullet"/>
+      <w:lvlText w:val=""/>
+      <w:lvlJc w:val="start"/>
+      <w:pPr>
+        <w:tabs>
+          <w:tab w:val="num" w:pos="6381"/>
+        </w:tabs>
+        <w:ind w:start="6381" w:hanging="283"/>
+      </w:pPr>
+      <w:rPr>
+        <w:rFonts w:ascii="Symbol" w:hAnsi="Symbol" w:cs="Symbol" w:hint="default"/>
+      </w:rPr>
+    </w:lvl>
+  </w:abstractNum>
+  <w:abstractNum w:abstractNumId="12">
+    <w:lvl w:ilvl="0">
+      <w:start w:val="1"/>
+      <w:numFmt w:val="bullet"/>
+      <w:lvlText w:val=""/>
+      <w:lvlJc w:val="start"/>
+      <w:pPr>
+        <w:tabs>
+          <w:tab w:val="num" w:pos="709"/>
+        </w:tabs>
+        <w:ind w:start="709" w:hanging="283"/>
+      </w:pPr>
+      <w:rPr>
+        <w:rFonts w:ascii="Symbol" w:hAnsi="Symbol" w:cs="Symbol" w:hint="default"/>
+      </w:rPr>
+    </w:lvl>
+    <w:lvl w:ilvl="1">
+      <w:start w:val="1"/>
+      <w:numFmt w:val="bullet"/>
+      <w:lvlText w:val=""/>
+      <w:lvlJc w:val="start"/>
+      <w:pPr>
+        <w:tabs>
+          <w:tab w:val="num" w:pos="1418"/>
+        </w:tabs>
+        <w:ind w:start="1418" w:hanging="283"/>
+      </w:pPr>
+      <w:rPr>
+        <w:rFonts w:ascii="Symbol" w:hAnsi="Symbol" w:cs="Symbol" w:hint="default"/>
+      </w:rPr>
+    </w:lvl>
+    <w:lvl w:ilvl="2">
+      <w:start w:val="1"/>
+      <w:numFmt w:val="bullet"/>
+      <w:lvlText w:val=""/>
+      <w:lvlJc w:val="start"/>
+      <w:pPr>
+        <w:tabs>
+          <w:tab w:val="num" w:pos="2127"/>
+        </w:tabs>
+        <w:ind w:start="2127" w:hanging="283"/>
+      </w:pPr>
+      <w:rPr>
+        <w:rFonts w:ascii="Symbol" w:hAnsi="Symbol" w:cs="Symbol" w:hint="default"/>
+      </w:rPr>
+    </w:lvl>
+    <w:lvl w:ilvl="3">
+      <w:start w:val="1"/>
+      <w:numFmt w:val="bullet"/>
+      <w:lvlText w:val=""/>
+      <w:lvlJc w:val="start"/>
+      <w:pPr>
+        <w:tabs>
+          <w:tab w:val="num" w:pos="2836"/>
+        </w:tabs>
+        <w:ind w:start="2836" w:hanging="283"/>
+      </w:pPr>
+      <w:rPr>
+        <w:rFonts w:ascii="Symbol" w:hAnsi="Symbol" w:cs="Symbol" w:hint="default"/>
+      </w:rPr>
+    </w:lvl>
+    <w:lvl w:ilvl="4">
+      <w:start w:val="1"/>
+      <w:numFmt w:val="bullet"/>
+      <w:lvlText w:val=""/>
+      <w:lvlJc w:val="start"/>
+      <w:pPr>
+        <w:tabs>
+          <w:tab w:val="num" w:pos="3545"/>
+        </w:tabs>
+        <w:ind w:start="3545" w:hanging="283"/>
+      </w:pPr>
+      <w:rPr>
+        <w:rFonts w:ascii="Symbol" w:hAnsi="Symbol" w:cs="Symbol" w:hint="default"/>
+      </w:rPr>
+    </w:lvl>
+    <w:lvl w:ilvl="5">
+      <w:start w:val="1"/>
+      <w:numFmt w:val="bullet"/>
+      <w:lvlText w:val=""/>
+      <w:lvlJc w:val="start"/>
+      <w:pPr>
+        <w:tabs>
+          <w:tab w:val="num" w:pos="4254"/>
+        </w:tabs>
+        <w:ind w:start="4254" w:hanging="283"/>
+      </w:pPr>
+      <w:rPr>
+        <w:rFonts w:ascii="Symbol" w:hAnsi="Symbol" w:cs="Symbol" w:hint="default"/>
+      </w:rPr>
+    </w:lvl>
+    <w:lvl w:ilvl="6">
+      <w:start w:val="1"/>
+      <w:numFmt w:val="bullet"/>
+      <w:lvlText w:val=""/>
+      <w:lvlJc w:val="start"/>
+      <w:pPr>
+        <w:tabs>
+          <w:tab w:val="num" w:pos="4963"/>
+        </w:tabs>
+        <w:ind w:start="4963" w:hanging="283"/>
+      </w:pPr>
+      <w:rPr>
+        <w:rFonts w:ascii="Symbol" w:hAnsi="Symbol" w:cs="Symbol" w:hint="default"/>
+      </w:rPr>
+    </w:lvl>
+    <w:lvl w:ilvl="7">
+      <w:start w:val="1"/>
+      <w:numFmt w:val="bullet"/>
+      <w:lvlText w:val=""/>
+      <w:lvlJc w:val="start"/>
+      <w:pPr>
+        <w:tabs>
+          <w:tab w:val="num" w:pos="5672"/>
+        </w:tabs>
+        <w:ind w:start="5672" w:hanging="283"/>
+      </w:pPr>
+      <w:rPr>
+        <w:rFonts w:ascii="Symbol" w:hAnsi="Symbol" w:cs="Symbol" w:hint="default"/>
+      </w:rPr>
+    </w:lvl>
+    <w:lvl w:ilvl="8">
+      <w:start w:val="1"/>
+      <w:numFmt w:val="bullet"/>
+      <w:lvlText w:val=""/>
+      <w:lvlJc w:val="start"/>
+      <w:pPr>
+        <w:tabs>
+          <w:tab w:val="num" w:pos="6381"/>
+        </w:tabs>
+        <w:ind w:start="6381" w:hanging="283"/>
+      </w:pPr>
+      <w:rPr>
+        <w:rFonts w:ascii="Symbol" w:hAnsi="Symbol" w:cs="Symbol" w:hint="default"/>
+      </w:rPr>
+    </w:lvl>
+  </w:abstractNum>
+  <w:abstractNum w:abstractNumId="13">
+    <w:lvl w:ilvl="0">
+      <w:start w:val="1"/>
+      <w:numFmt w:val="decimal"/>
+      <w:lvlText w:val="%1."/>
+      <w:lvlJc w:val="start"/>
+      <w:pPr>
+        <w:tabs>
+          <w:tab w:val="num" w:pos="709"/>
+        </w:tabs>
+        <w:ind w:start="709" w:hanging="283"/>
+      </w:pPr>
+      <w:rPr/>
+    </w:lvl>
+    <w:lvl w:ilvl="1">
+      <w:start w:val="1"/>
+      <w:numFmt w:val="decimal"/>
+      <w:lvlText w:val="%2."/>
+      <w:lvlJc w:val="start"/>
+      <w:pPr>
+        <w:tabs>
+          <w:tab w:val="num" w:pos="1418"/>
+        </w:tabs>
+        <w:ind w:start="1418" w:hanging="283"/>
+      </w:pPr>
+      <w:rPr/>
+    </w:lvl>
+    <w:lvl w:ilvl="2">
+      <w:start w:val="1"/>
+      <w:numFmt w:val="decimal"/>
+      <w:lvlText w:val="%3."/>
+      <w:lvlJc w:val="start"/>
+      <w:pPr>
+        <w:tabs>
+          <w:tab w:val="num" w:pos="2127"/>
+        </w:tabs>
+        <w:ind w:start="2127" w:hanging="283"/>
+      </w:pPr>
+      <w:rPr/>
+    </w:lvl>
+    <w:lvl w:ilvl="3">
+      <w:start w:val="1"/>
+      <w:numFmt w:val="decimal"/>
+      <w:lvlText w:val="%4."/>
+      <w:lvlJc w:val="start"/>
+      <w:pPr>
+        <w:tabs>
+          <w:tab w:val="num" w:pos="2836"/>
+        </w:tabs>
+        <w:ind w:start="2836" w:hanging="283"/>
+      </w:pPr>
+      <w:rPr/>
+    </w:lvl>
+    <w:lvl w:ilvl="4">
+      <w:start w:val="1"/>
+      <w:numFmt w:val="decimal"/>
+      <w:lvlText w:val="%5."/>
+      <w:lvlJc w:val="start"/>
+      <w:pPr>
+        <w:tabs>
+          <w:tab w:val="num" w:pos="3545"/>
+        </w:tabs>
+        <w:ind w:start="3545" w:hanging="283"/>
+      </w:pPr>
+      <w:rPr/>
+    </w:lvl>
+    <w:lvl w:ilvl="5">
+      <w:start w:val="1"/>
+      <w:numFmt w:val="decimal"/>
+      <w:lvlText w:val="%6."/>
+      <w:lvlJc w:val="start"/>
+      <w:pPr>
+        <w:tabs>
+          <w:tab w:val="num" w:pos="4254"/>
+        </w:tabs>
+        <w:ind w:start="4254" w:hanging="283"/>
+      </w:pPr>
+      <w:rPr/>
+    </w:lvl>
+    <w:lvl w:ilvl="6">
+      <w:start w:val="1"/>
+      <w:numFmt w:val="decimal"/>
+      <w:lvlText w:val="%7."/>
+      <w:lvlJc w:val="start"/>
+      <w:pPr>
+        <w:tabs>
+          <w:tab w:val="num" w:pos="4963"/>
+        </w:tabs>
+        <w:ind w:start="4963" w:hanging="283"/>
+      </w:pPr>
+      <w:rPr/>
+    </w:lvl>
+    <w:lvl w:ilvl="7">
+      <w:start w:val="1"/>
+      <w:numFmt w:val="decimal"/>
+      <w:lvlText w:val="%8."/>
+      <w:lvlJc w:val="start"/>
+      <w:pPr>
+        <w:tabs>
+          <w:tab w:val="num" w:pos="5672"/>
+        </w:tabs>
+        <w:ind w:start="5672" w:hanging="283"/>
+      </w:pPr>
+      <w:rPr/>
+    </w:lvl>
+    <w:lvl w:ilvl="8">
+      <w:start w:val="1"/>
+      <w:numFmt w:val="decimal"/>
+      <w:lvlText w:val="%9."/>
+      <w:lvlJc w:val="start"/>
+      <w:pPr>
+        <w:tabs>
+          <w:tab w:val="num" w:pos="6381"/>
+        </w:tabs>
+        <w:ind w:start="6381" w:hanging="283"/>
+      </w:pPr>
+      <w:rPr/>
+    </w:lvl>
+  </w:abstractNum>
+  <w:abstractNum w:abstractNumId="14">
+    <w:lvl w:ilvl="0">
+      <w:start w:val="1"/>
+      <w:numFmt w:val="bullet"/>
+      <w:lvlText w:val=""/>
+      <w:lvlJc w:val="start"/>
+      <w:pPr>
+        <w:tabs>
+          <w:tab w:val="num" w:pos="709"/>
+        </w:tabs>
+        <w:ind w:start="709" w:hanging="283"/>
+      </w:pPr>
+      <w:rPr>
+        <w:rFonts w:ascii="Symbol" w:hAnsi="Symbol" w:cs="Symbol" w:hint="default"/>
+      </w:rPr>
+    </w:lvl>
+    <w:lvl w:ilvl="1">
+      <w:start w:val="1"/>
+      <w:numFmt w:val="bullet"/>
+      <w:lvlText w:val=""/>
+      <w:lvlJc w:val="start"/>
+      <w:pPr>
+        <w:tabs>
+          <w:tab w:val="num" w:pos="1418"/>
+        </w:tabs>
+        <w:ind w:start="1418" w:hanging="283"/>
+      </w:pPr>
+      <w:rPr>
+        <w:rFonts w:ascii="Symbol" w:hAnsi="Symbol" w:cs="Symbol" w:hint="default"/>
+      </w:rPr>
+    </w:lvl>
+    <w:lvl w:ilvl="2">
+      <w:start w:val="1"/>
+      <w:numFmt w:val="bullet"/>
+      <w:lvlText w:val=""/>
+      <w:lvlJc w:val="start"/>
+      <w:pPr>
+        <w:tabs>
+          <w:tab w:val="num" w:pos="2127"/>
+        </w:tabs>
+        <w:ind w:start="2127" w:hanging="283"/>
+      </w:pPr>
+      <w:rPr>
+        <w:rFonts w:ascii="Symbol" w:hAnsi="Symbol" w:cs="Symbol" w:hint="default"/>
+      </w:rPr>
+    </w:lvl>
+    <w:lvl w:ilvl="3">
+      <w:start w:val="1"/>
+      <w:numFmt w:val="bullet"/>
+      <w:lvlText w:val=""/>
+      <w:lvlJc w:val="start"/>
+      <w:pPr>
+        <w:tabs>
+          <w:tab w:val="num" w:pos="2836"/>
+        </w:tabs>
+        <w:ind w:start="2836" w:hanging="283"/>
+      </w:pPr>
+      <w:rPr>
+        <w:rFonts w:ascii="Symbol" w:hAnsi="Symbol" w:cs="Symbol" w:hint="default"/>
+      </w:rPr>
+    </w:lvl>
+    <w:lvl w:ilvl="4">
+      <w:start w:val="1"/>
+      <w:numFmt w:val="bullet"/>
+      <w:lvlText w:val=""/>
+      <w:lvlJc w:val="start"/>
+      <w:pPr>
+        <w:tabs>
+          <w:tab w:val="num" w:pos="3545"/>
+        </w:tabs>
+        <w:ind w:start="3545" w:hanging="283"/>
+      </w:pPr>
+      <w:rPr>
+        <w:rFonts w:ascii="Symbol" w:hAnsi="Symbol" w:cs="Symbol" w:hint="default"/>
+      </w:rPr>
+    </w:lvl>
+    <w:lvl w:ilvl="5">
+      <w:start w:val="1"/>
+      <w:numFmt w:val="bullet"/>
+      <w:lvlText w:val=""/>
+      <w:lvlJc w:val="start"/>
+      <w:pPr>
+        <w:tabs>
+          <w:tab w:val="num" w:pos="4254"/>
+        </w:tabs>
+        <w:ind w:start="4254" w:hanging="283"/>
+      </w:pPr>
+      <w:rPr>
+        <w:rFonts w:ascii="Symbol" w:hAnsi="Symbol" w:cs="Symbol" w:hint="default"/>
+      </w:rPr>
+    </w:lvl>
+    <w:lvl w:ilvl="6">
+      <w:start w:val="1"/>
+      <w:numFmt w:val="bullet"/>
+      <w:lvlText w:val=""/>
+      <w:lvlJc w:val="start"/>
+      <w:pPr>
+        <w:tabs>
+          <w:tab w:val="num" w:pos="4963"/>
+        </w:tabs>
+        <w:ind w:start="4963" w:hanging="283"/>
+      </w:pPr>
+      <w:rPr>
+        <w:rFonts w:ascii="Symbol" w:hAnsi="Symbol" w:cs="Symbol" w:hint="default"/>
+      </w:rPr>
+    </w:lvl>
+    <w:lvl w:ilvl="7">
+      <w:start w:val="1"/>
+      <w:numFmt w:val="bullet"/>
+      <w:lvlText w:val=""/>
+      <w:lvlJc w:val="start"/>
+      <w:pPr>
+        <w:tabs>
+          <w:tab w:val="num" w:pos="5672"/>
+        </w:tabs>
+        <w:ind w:start="5672" w:hanging="283"/>
+      </w:pPr>
+      <w:rPr>
+        <w:rFonts w:ascii="Symbol" w:hAnsi="Symbol" w:cs="Symbol" w:hint="default"/>
+      </w:rPr>
+    </w:lvl>
+    <w:lvl w:ilvl="8">
+      <w:start w:val="1"/>
+      <w:numFmt w:val="bullet"/>
+      <w:lvlText w:val=""/>
+      <w:lvlJc w:val="start"/>
+      <w:pPr>
+        <w:tabs>
+          <w:tab w:val="num" w:pos="6381"/>
+        </w:tabs>
+        <w:ind w:start="6381" w:hanging="283"/>
+      </w:pPr>
+      <w:rPr>
+        <w:rFonts w:ascii="Symbol" w:hAnsi="Symbol" w:cs="Symbol" w:hint="default"/>
+      </w:rPr>
+    </w:lvl>
+  </w:abstractNum>
+  <w:abstractNum w:abstractNumId="15">
+    <w:lvl w:ilvl="0">
+      <w:start w:val="1"/>
+      <w:numFmt w:val="bullet"/>
+      <w:lvlText w:val=""/>
+      <w:lvlJc w:val="start"/>
+      <w:pPr>
+        <w:tabs>
+          <w:tab w:val="num" w:pos="709"/>
+        </w:tabs>
+        <w:ind w:start="709" w:hanging="283"/>
+      </w:pPr>
+      <w:rPr>
+        <w:rFonts w:ascii="Symbol" w:hAnsi="Symbol" w:cs="Symbol" w:hint="default"/>
+      </w:rPr>
+    </w:lvl>
+    <w:lvl w:ilvl="1">
+      <w:start w:val="1"/>
+      <w:numFmt w:val="bullet"/>
+      <w:lvlText w:val=""/>
+      <w:lvlJc w:val="start"/>
+      <w:pPr>
+        <w:tabs>
+          <w:tab w:val="num" w:pos="1418"/>
+        </w:tabs>
+        <w:ind w:start="1418" w:hanging="283"/>
+      </w:pPr>
+      <w:rPr>
+        <w:rFonts w:ascii="Symbol" w:hAnsi="Symbol" w:cs="Symbol" w:hint="default"/>
+      </w:rPr>
+    </w:lvl>
+    <w:lvl w:ilvl="2">
+      <w:start w:val="1"/>
+      <w:numFmt w:val="bullet"/>
+      <w:lvlText w:val=""/>
+      <w:lvlJc w:val="start"/>
+      <w:pPr>
+        <w:tabs>
+          <w:tab w:val="num" w:pos="2127"/>
+        </w:tabs>
+        <w:ind w:start="2127" w:hanging="283"/>
+      </w:pPr>
+      <w:rPr>
+        <w:rFonts w:ascii="Symbol" w:hAnsi="Symbol" w:cs="Symbol" w:hint="default"/>
+      </w:rPr>
+    </w:lvl>
+    <w:lvl w:ilvl="3">
+      <w:start w:val="1"/>
+      <w:numFmt w:val="bullet"/>
+      <w:lvlText w:val=""/>
+      <w:lvlJc w:val="start"/>
+      <w:pPr>
+        <w:tabs>
+          <w:tab w:val="num" w:pos="2836"/>
+        </w:tabs>
+        <w:ind w:start="2836" w:hanging="283"/>
+      </w:pPr>
+      <w:rPr>
+        <w:rFonts w:ascii="Symbol" w:hAnsi="Symbol" w:cs="Symbol" w:hint="default"/>
+      </w:rPr>
+    </w:lvl>
+    <w:lvl w:ilvl="4">
+      <w:start w:val="1"/>
+      <w:numFmt w:val="bullet"/>
+      <w:lvlText w:val=""/>
+      <w:lvlJc w:val="start"/>
+      <w:pPr>
+        <w:tabs>
+          <w:tab w:val="num" w:pos="3545"/>
+        </w:tabs>
+        <w:ind w:start="3545" w:hanging="283"/>
+      </w:pPr>
+      <w:rPr>
+        <w:rFonts w:ascii="Symbol" w:hAnsi="Symbol" w:cs="Symbol" w:hint="default"/>
+      </w:rPr>
+    </w:lvl>
+    <w:lvl w:ilvl="5">
+      <w:start w:val="1"/>
+      <w:numFmt w:val="bullet"/>
+      <w:lvlText w:val=""/>
+      <w:lvlJc w:val="start"/>
+      <w:pPr>
+        <w:tabs>
+          <w:tab w:val="num" w:pos="4254"/>
+        </w:tabs>
+        <w:ind w:start="4254" w:hanging="283"/>
+      </w:pPr>
+      <w:rPr>
+        <w:rFonts w:ascii="Symbol" w:hAnsi="Symbol" w:cs="Symbol" w:hint="default"/>
+      </w:rPr>
+    </w:lvl>
+    <w:lvl w:ilvl="6">
+      <w:start w:val="1"/>
+      <w:numFmt w:val="bullet"/>
+      <w:lvlText w:val=""/>
+      <w:lvlJc w:val="start"/>
+      <w:pPr>
+        <w:tabs>
+          <w:tab w:val="num" w:pos="4963"/>
+        </w:tabs>
+        <w:ind w:start="4963" w:hanging="283"/>
+      </w:pPr>
+      <w:rPr>
+        <w:rFonts w:ascii="Symbol" w:hAnsi="Symbol" w:cs="Symbol" w:hint="default"/>
+      </w:rPr>
+    </w:lvl>
+    <w:lvl w:ilvl="7">
+      <w:start w:val="1"/>
+      <w:numFmt w:val="bullet"/>
+      <w:lvlText w:val=""/>
+      <w:lvlJc w:val="start"/>
+      <w:pPr>
+        <w:tabs>
+          <w:tab w:val="num" w:pos="5672"/>
+        </w:tabs>
+        <w:ind w:start="5672" w:hanging="283"/>
+      </w:pPr>
+      <w:rPr>
+        <w:rFonts w:ascii="Symbol" w:hAnsi="Symbol" w:cs="Symbol" w:hint="default"/>
+      </w:rPr>
+    </w:lvl>
+    <w:lvl w:ilvl="8">
+      <w:start w:val="1"/>
+      <w:numFmt w:val="bullet"/>
+      <w:lvlText w:val=""/>
+      <w:lvlJc w:val="start"/>
+      <w:pPr>
+        <w:tabs>
+          <w:tab w:val="num" w:pos="6381"/>
+        </w:tabs>
+        <w:ind w:start="6381" w:hanging="283"/>
+      </w:pPr>
+      <w:rPr>
+        <w:rFonts w:ascii="Symbol" w:hAnsi="Symbol" w:cs="Symbol" w:hint="default"/>
+      </w:rPr>
+    </w:lvl>
+  </w:abstractNum>
+  <w:abstractNum w:abstractNumId="16">
+    <w:lvl w:ilvl="0">
+      <w:start w:val="1"/>
+      <w:numFmt w:val="bullet"/>
+      <w:lvlText w:val=""/>
+      <w:lvlJc w:val="start"/>
+      <w:pPr>
+        <w:tabs>
+          <w:tab w:val="num" w:pos="709"/>
+        </w:tabs>
+        <w:ind w:start="709" w:hanging="283"/>
+      </w:pPr>
+      <w:rPr>
+        <w:rFonts w:ascii="Symbol" w:hAnsi="Symbol" w:cs="Symbol" w:hint="default"/>
+      </w:rPr>
+    </w:lvl>
+    <w:lvl w:ilvl="1">
+      <w:start w:val="1"/>
+      <w:numFmt w:val="bullet"/>
+      <w:lvlText w:val=""/>
+      <w:lvlJc w:val="start"/>
+      <w:pPr>
+        <w:tabs>
+          <w:tab w:val="num" w:pos="1418"/>
+        </w:tabs>
+        <w:ind w:start="1418" w:hanging="283"/>
+      </w:pPr>
+      <w:rPr>
+        <w:rFonts w:ascii="Symbol" w:hAnsi="Symbol" w:cs="Symbol" w:hint="default"/>
+      </w:rPr>
+    </w:lvl>
+    <w:lvl w:ilvl="2">
+      <w:start w:val="1"/>
+      <w:numFmt w:val="bullet"/>
+      <w:lvlText w:val=""/>
+      <w:lvlJc w:val="start"/>
+      <w:pPr>
+        <w:tabs>
+          <w:tab w:val="num" w:pos="2127"/>
+        </w:tabs>
+        <w:ind w:start="2127" w:hanging="283"/>
+      </w:pPr>
+      <w:rPr>
+        <w:rFonts w:ascii="Symbol" w:hAnsi="Symbol" w:cs="Symbol" w:hint="default"/>
+      </w:rPr>
+    </w:lvl>
+    <w:lvl w:ilvl="3">
+      <w:start w:val="1"/>
+      <w:numFmt w:val="bullet"/>
+      <w:lvlText w:val=""/>
+      <w:lvlJc w:val="start"/>
+      <w:pPr>
+        <w:tabs>
+          <w:tab w:val="num" w:pos="2836"/>
+        </w:tabs>
+        <w:ind w:start="2836" w:hanging="283"/>
+      </w:pPr>
+      <w:rPr>
+        <w:rFonts w:ascii="Symbol" w:hAnsi="Symbol" w:cs="Symbol" w:hint="default"/>
+      </w:rPr>
+    </w:lvl>
+    <w:lvl w:ilvl="4">
+      <w:start w:val="1"/>
+      <w:numFmt w:val="bullet"/>
+      <w:lvlText w:val=""/>
+      <w:lvlJc w:val="start"/>
+      <w:pPr>
+        <w:tabs>
+          <w:tab w:val="num" w:pos="3545"/>
+        </w:tabs>
+        <w:ind w:start="3545" w:hanging="283"/>
+      </w:pPr>
+      <w:rPr>
+        <w:rFonts w:ascii="Symbol" w:hAnsi="Symbol" w:cs="Symbol" w:hint="default"/>
+      </w:rPr>
+    </w:lvl>
+    <w:lvl w:ilvl="5">
+      <w:start w:val="1"/>
+      <w:numFmt w:val="bullet"/>
+      <w:lvlText w:val=""/>
+      <w:lvlJc w:val="start"/>
+      <w:pPr>
+        <w:tabs>
+          <w:tab w:val="num" w:pos="4254"/>
+        </w:tabs>
+        <w:ind w:start="4254" w:hanging="283"/>
+      </w:pPr>
+      <w:rPr>
+        <w:rFonts w:ascii="Symbol" w:hAnsi="Symbol" w:cs="Symbol" w:hint="default"/>
+      </w:rPr>
+    </w:lvl>
+    <w:lvl w:ilvl="6">
+      <w:start w:val="1"/>
+      <w:numFmt w:val="bullet"/>
+      <w:lvlText w:val=""/>
+      <w:lvlJc w:val="start"/>
+      <w:pPr>
+        <w:tabs>
+          <w:tab w:val="num" w:pos="4963"/>
+        </w:tabs>
+        <w:ind w:start="4963" w:hanging="283"/>
+      </w:pPr>
+      <w:rPr>
+        <w:rFonts w:ascii="Symbol" w:hAnsi="Symbol" w:cs="Symbol" w:hint="default"/>
+      </w:rPr>
+    </w:lvl>
+    <w:lvl w:ilvl="7">
+      <w:start w:val="1"/>
+      <w:numFmt w:val="bullet"/>
+      <w:lvlText w:val=""/>
+      <w:lvlJc w:val="start"/>
+      <w:pPr>
+        <w:tabs>
+          <w:tab w:val="num" w:pos="5672"/>
+        </w:tabs>
+        <w:ind w:start="5672" w:hanging="283"/>
+      </w:pPr>
+      <w:rPr>
+        <w:rFonts w:ascii="Symbol" w:hAnsi="Symbol" w:cs="Symbol" w:hint="default"/>
+      </w:rPr>
+    </w:lvl>
+    <w:lvl w:ilvl="8">
+      <w:start w:val="1"/>
+      <w:numFmt w:val="bullet"/>
+      <w:lvlText w:val=""/>
+      <w:lvlJc w:val="start"/>
+      <w:pPr>
+        <w:tabs>
+          <w:tab w:val="num" w:pos="6381"/>
+        </w:tabs>
+        <w:ind w:start="6381" w:hanging="283"/>
+      </w:pPr>
+      <w:rPr>
+        <w:rFonts w:ascii="Symbol" w:hAnsi="Symbol" w:cs="Symbol" w:hint="default"/>
+      </w:rPr>
+    </w:lvl>
+  </w:abstractNum>
+  <w:abstractNum w:abstractNumId="17">
     <w:lvl w:ilvl="0">
       <w:start w:val="1"/>
       <w:numFmt w:val="none"/>
@@ -2805,6 +5599,24 @@
   </w:num>
   <w:num w:numId="11">
     <w:abstractNumId w:val="11"/>
+  </w:num>
+  <w:num w:numId="12">
+    <w:abstractNumId w:val="12"/>
+  </w:num>
+  <w:num w:numId="13">
+    <w:abstractNumId w:val="13"/>
+  </w:num>
+  <w:num w:numId="14">
+    <w:abstractNumId w:val="14"/>
+  </w:num>
+  <w:num w:numId="15">
+    <w:abstractNumId w:val="15"/>
+  </w:num>
+  <w:num w:numId="16">
+    <w:abstractNumId w:val="16"/>
+  </w:num>
+  <w:num w:numId="17">
+    <w:abstractNumId w:val="17"/>
   </w:num>
 </w:numbering>
 </file>
@@ -2911,6 +5723,11 @@
       <w:b/>
       <w:bCs/>
     </w:rPr>
+  </w:style>
+  <w:style w:type="character" w:styleId="NumberingSymbols">
+    <w:name w:val="Numbering Symbols"/>
+    <w:qFormat/>
+    <w:rPr/>
   </w:style>
   <w:style w:type="paragraph" w:styleId="Heading">
     <w:name w:val="Heading"/>

</xml_diff>